<commit_message>
lab11: make document ready
</commit_message>
<xml_diff>
--- a/lab11/lab11_report.docx
+++ b/lab11/lab11_report.docx
@@ -228,7 +228,6 @@
         <w:keepLines/>
         <w:spacing w:before="360" w:after="120" w:line="360" w:lineRule="auto"/>
         <w:ind w:right="360"/>
-        <w:jc w:val="center"/>
         <w:outlineLvl w:val="0"/>
         <w:rPr>
           <w:rFonts w:ascii="Times New Roman" w:eastAsiaTheme="majorEastAsia" w:hAnsi="Times New Roman" w:cs="Times New Roman"/>
@@ -327,11 +326,265 @@
     </w:p>
     <w:p>
       <w:pPr>
-        <w:keepNext/>
-        <w:keepLines/>
-        <w:spacing w:before="360" w:after="120" w:line="360" w:lineRule="auto"/>
-        <w:ind w:right="360"/>
-        <w:outlineLvl w:val="0"/>
+        <w:rPr>
+          <w:b/>
+          <w:bCs/>
+          <w:u w:val="single"/>
+          <w:lang w:val="en-US" w:eastAsia="nb-NO"/>
+        </w:rPr>
+      </w:pPr>
+      <w:r>
+        <w:rPr>
+          <w:b/>
+          <w:bCs/>
+          <w:u w:val="single"/>
+          <w:lang w:val="en-US" w:eastAsia="nb-NO"/>
+        </w:rPr>
+        <w:t>Output:</w:t>
+      </w:r>
+    </w:p>
+    <w:p>
+      <w:pPr>
+        <w:pStyle w:val="Listeavsnitt"/>
+        <w:numPr>
+          <w:ilvl w:val="0"/>
+          <w:numId w:val="27"/>
+        </w:numPr>
+        <w:rPr>
+          <w:lang w:val="en-US" w:eastAsia="nb-NO"/>
+        </w:rPr>
+      </w:pPr>
+      <w:r>
+        <w:rPr>
+          <w:lang w:val="en-US" w:eastAsia="nb-NO"/>
+        </w:rPr>
+        <w:t>Subtask 1: Run code, include output:</w:t>
+      </w:r>
+    </w:p>
+    <w:p>
+      <w:pPr>
+        <w:pStyle w:val="Listeavsnitt"/>
+        <w:numPr>
+          <w:ilvl w:val="0"/>
+          <w:numId w:val="27"/>
+        </w:numPr>
+        <w:rPr>
+          <w:lang w:val="en-US" w:eastAsia="nb-NO"/>
+        </w:rPr>
+      </w:pPr>
+      <w:r>
+        <w:rPr>
+          <w:lang w:val="en-US" w:eastAsia="nb-NO"/>
+        </w:rPr>
+        <w:t>Subtask 2: Which class should run first?</w:t>
+      </w:r>
+    </w:p>
+    <w:p>
+      <w:pPr>
+        <w:pStyle w:val="Listeavsnitt"/>
+        <w:numPr>
+          <w:ilvl w:val="0"/>
+          <w:numId w:val="27"/>
+        </w:numPr>
+        <w:rPr>
+          <w:lang w:val="en-US" w:eastAsia="nb-NO"/>
+        </w:rPr>
+      </w:pPr>
+      <w:r>
+        <w:rPr>
+          <w:lang w:val="en-US" w:eastAsia="nb-NO"/>
+        </w:rPr>
+        <w:t>Subtask</w:t>
+      </w:r>
+      <w:r>
+        <w:rPr>
+          <w:lang w:val="en-US" w:eastAsia="nb-NO"/>
+        </w:rPr>
+        <w:t xml:space="preserve"> </w:t>
+      </w:r>
+      <w:r>
+        <w:rPr>
+          <w:lang w:val="en-US" w:eastAsia="nb-NO"/>
+        </w:rPr>
+        <w:t>3:</w:t>
+      </w:r>
+      <w:r>
+        <w:rPr>
+          <w:lang w:val="en-US" w:eastAsia="nb-NO"/>
+        </w:rPr>
+        <w:t xml:space="preserve"> Which port number is used for Client, and which for Server?</w:t>
+      </w:r>
+    </w:p>
+    <w:p>
+      <w:pPr>
+        <w:pStyle w:val="Listeavsnitt"/>
+        <w:numPr>
+          <w:ilvl w:val="0"/>
+          <w:numId w:val="27"/>
+        </w:numPr>
+        <w:rPr>
+          <w:lang w:val="en-US" w:eastAsia="nb-NO"/>
+        </w:rPr>
+      </w:pPr>
+      <w:r>
+        <w:rPr>
+          <w:lang w:val="en-US" w:eastAsia="nb-NO"/>
+        </w:rPr>
+        <w:t>Subtask</w:t>
+      </w:r>
+      <w:r>
+        <w:rPr>
+          <w:lang w:val="en-US" w:eastAsia="nb-NO"/>
+        </w:rPr>
+        <w:t xml:space="preserve"> 4: What is the IP address or hostname of Client and Server?</w:t>
+      </w:r>
+    </w:p>
+    <w:p>
+      <w:pPr>
+        <w:rPr>
+          <w:b/>
+          <w:bCs/>
+          <w:u w:val="single"/>
+          <w:lang w:val="en-US" w:eastAsia="nb-NO"/>
+        </w:rPr>
+      </w:pPr>
+      <w:r>
+        <w:rPr>
+          <w:b/>
+          <w:bCs/>
+          <w:u w:val="single"/>
+          <w:lang w:val="en-US" w:eastAsia="nb-NO"/>
+        </w:rPr>
+        <w:t>Server:</w:t>
+      </w:r>
+    </w:p>
+    <w:p>
+      <w:pPr>
+        <w:pStyle w:val="Listeavsnitt"/>
+        <w:numPr>
+          <w:ilvl w:val="0"/>
+          <w:numId w:val="26"/>
+        </w:numPr>
+        <w:rPr>
+          <w:lang w:val="en-US" w:eastAsia="nb-NO"/>
+        </w:rPr>
+      </w:pPr>
+      <w:r>
+        <w:rPr>
+          <w:lang w:val="en-US" w:eastAsia="nb-NO"/>
+        </w:rPr>
+        <w:t>Subtask</w:t>
+      </w:r>
+      <w:r>
+        <w:rPr>
+          <w:lang w:val="en-US" w:eastAsia="nb-NO"/>
+        </w:rPr>
+        <w:t xml:space="preserve"> 5: W</w:t>
+      </w:r>
+      <w:r>
+        <w:rPr>
+          <w:lang w:val="en-US" w:eastAsia="nb-NO"/>
+        </w:rPr>
+        <w:t>hich line the Server opens the socket?</w:t>
+      </w:r>
+    </w:p>
+    <w:p>
+      <w:pPr>
+        <w:pStyle w:val="Listeavsnitt"/>
+        <w:numPr>
+          <w:ilvl w:val="0"/>
+          <w:numId w:val="26"/>
+        </w:numPr>
+        <w:rPr>
+          <w:lang w:val="en-US" w:eastAsia="nb-NO"/>
+        </w:rPr>
+      </w:pPr>
+      <w:r>
+        <w:rPr>
+          <w:lang w:val="en-US" w:eastAsia="nb-NO"/>
+        </w:rPr>
+        <w:t xml:space="preserve">Subtask </w:t>
+      </w:r>
+      <w:r>
+        <w:rPr>
+          <w:lang w:val="en-US" w:eastAsia="nb-NO"/>
+        </w:rPr>
+        <w:t xml:space="preserve">6: </w:t>
+      </w:r>
+      <w:r>
+        <w:rPr>
+          <w:lang w:val="en-US" w:eastAsia="nb-NO"/>
+        </w:rPr>
+        <w:t>Which line the Server waits for Client?</w:t>
+      </w:r>
+    </w:p>
+    <w:p>
+      <w:pPr>
+        <w:pStyle w:val="Listeavsnitt"/>
+        <w:numPr>
+          <w:ilvl w:val="0"/>
+          <w:numId w:val="26"/>
+        </w:numPr>
+        <w:rPr>
+          <w:lang w:val="en-US" w:eastAsia="nb-NO"/>
+        </w:rPr>
+      </w:pPr>
+      <w:r>
+        <w:rPr>
+          <w:lang w:val="en-US" w:eastAsia="nb-NO"/>
+        </w:rPr>
+        <w:t xml:space="preserve">Subtask </w:t>
+      </w:r>
+      <w:r>
+        <w:rPr>
+          <w:lang w:val="en-US" w:eastAsia="nb-NO"/>
+        </w:rPr>
+        <w:t xml:space="preserve">7: </w:t>
+      </w:r>
+      <w:r>
+        <w:rPr>
+          <w:lang w:val="en-US" w:eastAsia="nb-NO"/>
+        </w:rPr>
+        <w:t>Which lines the Server creates I/O Streams for communication with the Client?</w:t>
+      </w:r>
+    </w:p>
+    <w:p>
+      <w:pPr>
+        <w:pStyle w:val="Listeavsnitt"/>
+        <w:numPr>
+          <w:ilvl w:val="0"/>
+          <w:numId w:val="26"/>
+        </w:numPr>
+        <w:rPr>
+          <w:lang w:val="en-US" w:eastAsia="nb-NO"/>
+        </w:rPr>
+      </w:pPr>
+      <w:r>
+        <w:rPr>
+          <w:lang w:val="en-US" w:eastAsia="nb-NO"/>
+        </w:rPr>
+        <w:t xml:space="preserve">Subtask </w:t>
+      </w:r>
+      <w:r>
+        <w:rPr>
+          <w:lang w:val="en-US" w:eastAsia="nb-NO"/>
+        </w:rPr>
+        <w:t xml:space="preserve">8: </w:t>
+      </w:r>
+      <w:r>
+        <w:rPr>
+          <w:lang w:val="en-US" w:eastAsia="nb-NO"/>
+        </w:rPr>
+        <w:t>Which lines the Server performs communication with the Client?</w:t>
+      </w:r>
+    </w:p>
+    <w:p>
+      <w:pPr>
+        <w:pStyle w:val="Listeavsnitt"/>
+        <w:numPr>
+          <w:ilvl w:val="0"/>
+          <w:numId w:val="26"/>
+        </w:numPr>
         <w:rPr>
           <w:rFonts w:ascii="Times New Roman" w:eastAsiaTheme="majorEastAsia" w:hAnsi="Times New Roman" w:cs="Times New Roman"/>
           <w:b/>
@@ -345,6 +598,24 @@
       </w:pPr>
       <w:r>
         <w:rPr>
+          <w:lang w:val="en-US" w:eastAsia="nb-NO"/>
+        </w:rPr>
+        <w:t xml:space="preserve">Subtask </w:t>
+      </w:r>
+      <w:r>
+        <w:rPr>
+          <w:lang w:val="en-US" w:eastAsia="nb-NO"/>
+        </w:rPr>
+        <w:t xml:space="preserve">9: </w:t>
+      </w:r>
+      <w:r>
+        <w:rPr>
+          <w:lang w:val="en-US" w:eastAsia="nb-NO"/>
+        </w:rPr>
+        <w:t>Which line the connection is closed?</w:t>
+      </w:r>
+      <w:r>
+        <w:rPr>
           <w:rFonts w:ascii="Times New Roman" w:eastAsiaTheme="majorEastAsia" w:hAnsi="Times New Roman" w:cs="Times New Roman"/>
           <w:b/>
           <w:bCs/>
@@ -354,10 +625,150 @@
           <w:lang w:val="en-US" w:eastAsia="nb-NO"/>
           <w14:ligatures w14:val="none"/>
         </w:rPr>
-        <w:t xml:space="preserve">Exercise 1: </w:t>
-      </w:r>
-      <w:proofErr w:type="spellStart"/>
-      <w:r>
+        <w:t xml:space="preserve"> </w:t>
+      </w:r>
+    </w:p>
+    <w:p>
+      <w:pPr>
+        <w:rPr>
+          <w:b/>
+          <w:bCs/>
+          <w:u w:val="single"/>
+          <w:lang w:val="en-US" w:eastAsia="nb-NO"/>
+        </w:rPr>
+      </w:pPr>
+      <w:r>
+        <w:rPr>
+          <w:b/>
+          <w:bCs/>
+          <w:u w:val="single"/>
+          <w:lang w:val="en-US" w:eastAsia="nb-NO"/>
+        </w:rPr>
+        <w:t>Client:</w:t>
+      </w:r>
+    </w:p>
+    <w:p>
+      <w:pPr>
+        <w:pStyle w:val="Listeavsnitt"/>
+        <w:numPr>
+          <w:ilvl w:val="0"/>
+          <w:numId w:val="25"/>
+        </w:numPr>
+        <w:rPr>
+          <w:lang w:val="en-US" w:eastAsia="nb-NO"/>
+        </w:rPr>
+      </w:pPr>
+      <w:r>
+        <w:rPr>
+          <w:lang w:val="en-US" w:eastAsia="nb-NO"/>
+        </w:rPr>
+        <w:t>Subtask</w:t>
+      </w:r>
+      <w:r>
+        <w:rPr>
+          <w:lang w:val="en-US" w:eastAsia="nb-NO"/>
+        </w:rPr>
+        <w:t xml:space="preserve"> 10: Which line the Client creates a socket object?</w:t>
+      </w:r>
+    </w:p>
+    <w:p>
+      <w:pPr>
+        <w:pStyle w:val="Listeavsnitt"/>
+        <w:numPr>
+          <w:ilvl w:val="0"/>
+          <w:numId w:val="25"/>
+        </w:numPr>
+        <w:rPr>
+          <w:lang w:val="en-US" w:eastAsia="nb-NO"/>
+        </w:rPr>
+      </w:pPr>
+      <w:r>
+        <w:rPr>
+          <w:lang w:val="en-US" w:eastAsia="nb-NO"/>
+        </w:rPr>
+        <w:t>Subtask</w:t>
+      </w:r>
+      <w:r>
+        <w:rPr>
+          <w:lang w:val="en-US" w:eastAsia="nb-NO"/>
+        </w:rPr>
+        <w:t xml:space="preserve"> 11: Which lines the Client creates I/O Streams for communication with the Silent?</w:t>
+      </w:r>
+    </w:p>
+    <w:p>
+      <w:pPr>
+        <w:pStyle w:val="Listeavsnitt"/>
+        <w:numPr>
+          <w:ilvl w:val="0"/>
+          <w:numId w:val="25"/>
+        </w:numPr>
+        <w:rPr>
+          <w:lang w:val="en-US" w:eastAsia="nb-NO"/>
+        </w:rPr>
+      </w:pPr>
+      <w:r>
+        <w:rPr>
+          <w:lang w:val="en-US" w:eastAsia="nb-NO"/>
+        </w:rPr>
+        <w:t>Subtask</w:t>
+      </w:r>
+      <w:r>
+        <w:rPr>
+          <w:lang w:val="en-US" w:eastAsia="nb-NO"/>
+        </w:rPr>
+        <w:t xml:space="preserve"> 12: Which lines the Client performs communication with the Client?</w:t>
+      </w:r>
+    </w:p>
+    <w:p>
+      <w:pPr>
+        <w:pStyle w:val="Listeavsnitt"/>
+        <w:numPr>
+          <w:ilvl w:val="0"/>
+          <w:numId w:val="25"/>
+        </w:numPr>
+        <w:rPr>
+          <w:lang w:val="en-US" w:eastAsia="nb-NO"/>
+        </w:rPr>
+      </w:pPr>
+      <w:r>
+        <w:rPr>
+          <w:lang w:val="en-US" w:eastAsia="nb-NO"/>
+        </w:rPr>
+        <w:t>Subtask</w:t>
+      </w:r>
+      <w:r>
+        <w:rPr>
+          <w:lang w:val="en-US" w:eastAsia="nb-NO"/>
+        </w:rPr>
+        <w:t xml:space="preserve"> 13: Which line the connection is closed?</w:t>
+      </w:r>
+    </w:p>
+    <w:p>
+      <w:pPr>
+        <w:rPr>
+          <w:b/>
+          <w:bCs/>
+          <w:u w:val="single"/>
+          <w:lang w:val="en-US" w:eastAsia="nb-NO"/>
+        </w:rPr>
+      </w:pPr>
+      <w:r>
+        <w:rPr>
+          <w:b/>
+          <w:bCs/>
+          <w:u w:val="single"/>
+          <w:lang w:val="en-US" w:eastAsia="nb-NO"/>
+        </w:rPr>
+        <w:t>Finally:</w:t>
+      </w:r>
+    </w:p>
+    <w:p>
+      <w:pPr>
+        <w:pStyle w:val="Listeavsnitt"/>
+        <w:numPr>
+          <w:ilvl w:val="0"/>
+          <w:numId w:val="24"/>
+        </w:numPr>
         <w:rPr>
           <w:rFonts w:ascii="Times New Roman" w:eastAsiaTheme="majorEastAsia" w:hAnsi="Times New Roman" w:cs="Times New Roman"/>
           <w:b/>
@@ -368,17 +779,36 @@
           <w:lang w:val="en-US" w:eastAsia="nb-NO"/>
           <w14:ligatures w14:val="none"/>
         </w:rPr>
-        <w:t>SocketUDP</w:t>
-      </w:r>
-      <w:proofErr w:type="spellEnd"/>
+      </w:pPr>
+      <w:r>
+        <w:rPr>
+          <w:lang w:val="en-US" w:eastAsia="nb-NO"/>
+        </w:rPr>
+        <w:t>Subtask</w:t>
+      </w:r>
+      <w:r>
+        <w:rPr>
+          <w:lang w:val="en-US" w:eastAsia="nb-NO"/>
+        </w:rPr>
+        <w:t xml:space="preserve"> 14: How do you relate the above operations of Client and Server to the </w:t>
+      </w:r>
+      <w:r>
+        <w:rPr>
+          <w:b/>
+          <w:bCs/>
+          <w:lang w:val="en-US" w:eastAsia="nb-NO"/>
+        </w:rPr>
+        <w:t>Three-way handshake</w:t>
+      </w:r>
+      <w:r>
+        <w:rPr>
+          <w:lang w:val="en-US" w:eastAsia="nb-NO"/>
+        </w:rPr>
+        <w:t xml:space="preserve"> data transmission in TCP protocol?  </w:t>
+      </w:r>
     </w:p>
     <w:p>
       <w:pPr>
-        <w:keepNext/>
-        <w:keepLines/>
-        <w:spacing w:before="360" w:after="120" w:line="360" w:lineRule="auto"/>
-        <w:ind w:right="360"/>
-        <w:outlineLvl w:val="0"/>
         <w:rPr>
           <w:rFonts w:ascii="Times New Roman" w:eastAsiaTheme="majorEastAsia" w:hAnsi="Times New Roman" w:cs="Times New Roman"/>
           <w:b/>
@@ -390,7 +820,9 @@
           <w14:ligatures w14:val="none"/>
         </w:rPr>
       </w:pPr>
-      <w:r>
+    </w:p>
+    <w:p>
+      <w:pPr>
         <w:rPr>
           <w:rFonts w:ascii="Times New Roman" w:eastAsiaTheme="majorEastAsia" w:hAnsi="Times New Roman" w:cs="Times New Roman"/>
           <w:b/>
@@ -401,8 +833,7 @@
           <w:lang w:val="en-US" w:eastAsia="nb-NO"/>
           <w14:ligatures w14:val="none"/>
         </w:rPr>
-        <w:t xml:space="preserve">Exercise 1: </w:t>
-      </w:r>
+      </w:pPr>
       <w:r>
         <w:rPr>
           <w:rFonts w:ascii="Times New Roman" w:eastAsiaTheme="majorEastAsia" w:hAnsi="Times New Roman" w:cs="Times New Roman"/>
@@ -414,7 +845,250 @@
           <w:lang w:val="en-US" w:eastAsia="nb-NO"/>
           <w14:ligatures w14:val="none"/>
         </w:rPr>
+        <w:t xml:space="preserve">Exercise </w:t>
+      </w:r>
+      <w:r>
+        <w:rPr>
+          <w:rFonts w:ascii="Times New Roman" w:eastAsiaTheme="majorEastAsia" w:hAnsi="Times New Roman" w:cs="Times New Roman"/>
+          <w:b/>
+          <w:bCs/>
+          <w:kern w:val="0"/>
+          <w:sz w:val="36"/>
+          <w:szCs w:val="36"/>
+          <w:lang w:val="en-US" w:eastAsia="nb-NO"/>
+          <w14:ligatures w14:val="none"/>
+        </w:rPr>
+        <w:t>2</w:t>
+      </w:r>
+      <w:r>
+        <w:rPr>
+          <w:rFonts w:ascii="Times New Roman" w:eastAsiaTheme="majorEastAsia" w:hAnsi="Times New Roman" w:cs="Times New Roman"/>
+          <w:b/>
+          <w:bCs/>
+          <w:kern w:val="0"/>
+          <w:sz w:val="36"/>
+          <w:szCs w:val="36"/>
+          <w:lang w:val="en-US" w:eastAsia="nb-NO"/>
+          <w14:ligatures w14:val="none"/>
+        </w:rPr>
+        <w:t xml:space="preserve">: </w:t>
+      </w:r>
+      <w:proofErr w:type="spellStart"/>
+      <w:r>
+        <w:rPr>
+          <w:rFonts w:ascii="Times New Roman" w:eastAsiaTheme="majorEastAsia" w:hAnsi="Times New Roman" w:cs="Times New Roman"/>
+          <w:b/>
+          <w:bCs/>
+          <w:kern w:val="0"/>
+          <w:sz w:val="36"/>
+          <w:szCs w:val="36"/>
+          <w:lang w:val="en-US" w:eastAsia="nb-NO"/>
+          <w14:ligatures w14:val="none"/>
+        </w:rPr>
+        <w:t>SocketUDP</w:t>
+      </w:r>
+      <w:proofErr w:type="spellEnd"/>
+    </w:p>
+    <w:p>
+      <w:pPr>
+        <w:rPr>
+          <w:lang w:val="en-US" w:eastAsia="nb-NO"/>
+        </w:rPr>
+      </w:pPr>
+      <w:r>
+        <w:rPr>
+          <w:b/>
+          <w:bCs/>
+          <w:u w:val="single"/>
+          <w:lang w:val="en-US" w:eastAsia="nb-NO"/>
+        </w:rPr>
+        <w:t>Subtask 1:</w:t>
+      </w:r>
+      <w:r>
+        <w:rPr>
+          <w:lang w:val="en-US" w:eastAsia="nb-NO"/>
+        </w:rPr>
+        <w:t xml:space="preserve"> Run the code and include output:</w:t>
+      </w:r>
+    </w:p>
+    <w:p>
+      <w:pPr>
+        <w:rPr>
+          <w:lang w:val="en-US" w:eastAsia="nb-NO"/>
+        </w:rPr>
+      </w:pPr>
+      <w:r>
+        <w:rPr>
+          <w:b/>
+          <w:bCs/>
+          <w:u w:val="single"/>
+          <w:lang w:val="en-US" w:eastAsia="nb-NO"/>
+        </w:rPr>
+        <w:t>Subtask 2:</w:t>
+      </w:r>
+      <w:r>
+        <w:rPr>
+          <w:lang w:val="en-US" w:eastAsia="nb-NO"/>
+        </w:rPr>
+        <w:t xml:space="preserve"> Which class should run first?</w:t>
+      </w:r>
+    </w:p>
+    <w:p>
+      <w:pPr>
+        <w:rPr>
+          <w:lang w:val="en-US" w:eastAsia="nb-NO"/>
+        </w:rPr>
+      </w:pPr>
+      <w:r>
+        <w:rPr>
+          <w:b/>
+          <w:bCs/>
+          <w:u w:val="single"/>
+          <w:lang w:val="en-US" w:eastAsia="nb-NO"/>
+        </w:rPr>
+        <w:t>Subtask 3:</w:t>
+      </w:r>
+      <w:r>
+        <w:rPr>
+          <w:lang w:val="en-US" w:eastAsia="nb-NO"/>
+        </w:rPr>
+        <w:t xml:space="preserve"> Create the output </w:t>
+      </w:r>
+      <w:proofErr w:type="gramStart"/>
+      <w:r>
+        <w:rPr>
+          <w:lang w:val="en-US" w:eastAsia="nb-NO"/>
+        </w:rPr>
+        <w:t>similar to</w:t>
+      </w:r>
+      <w:proofErr w:type="gramEnd"/>
+      <w:r>
+        <w:rPr>
+          <w:lang w:val="en-US" w:eastAsia="nb-NO"/>
+        </w:rPr>
+        <w:t xml:space="preserve"> the figure below. How and why can the server receive multiple requests with multiple ports from client(s)?</w:t>
+      </w:r>
+    </w:p>
+    <w:p>
+      <w:pPr>
+        <w:keepNext/>
+        <w:keepLines/>
+        <w:spacing w:before="360" w:after="120" w:line="360" w:lineRule="auto"/>
+        <w:ind w:right="360"/>
+        <w:outlineLvl w:val="0"/>
+        <w:rPr>
+          <w:rFonts w:ascii="Times New Roman" w:eastAsiaTheme="majorEastAsia" w:hAnsi="Times New Roman" w:cs="Times New Roman"/>
+          <w:b/>
+          <w:bCs/>
+          <w:kern w:val="0"/>
+          <w:sz w:val="36"/>
+          <w:szCs w:val="36"/>
+          <w:lang w:val="en-US" w:eastAsia="nb-NO"/>
+          <w14:ligatures w14:val="none"/>
+        </w:rPr>
+      </w:pPr>
+      <w:r>
+        <w:rPr>
+          <w:rFonts w:ascii="Times New Roman" w:eastAsiaTheme="majorEastAsia" w:hAnsi="Times New Roman" w:cs="Times New Roman"/>
+          <w:b/>
+          <w:bCs/>
+          <w:kern w:val="0"/>
+          <w:sz w:val="36"/>
+          <w:szCs w:val="36"/>
+          <w:lang w:val="en-US" w:eastAsia="nb-NO"/>
+          <w14:ligatures w14:val="none"/>
+        </w:rPr>
+        <w:t xml:space="preserve">Exercise </w:t>
+      </w:r>
+      <w:r>
+        <w:rPr>
+          <w:rFonts w:ascii="Times New Roman" w:eastAsiaTheme="majorEastAsia" w:hAnsi="Times New Roman" w:cs="Times New Roman"/>
+          <w:b/>
+          <w:bCs/>
+          <w:kern w:val="0"/>
+          <w:sz w:val="36"/>
+          <w:szCs w:val="36"/>
+          <w:lang w:val="en-US" w:eastAsia="nb-NO"/>
+          <w14:ligatures w14:val="none"/>
+        </w:rPr>
+        <w:t>3</w:t>
+      </w:r>
+      <w:r>
+        <w:rPr>
+          <w:rFonts w:ascii="Times New Roman" w:eastAsiaTheme="majorEastAsia" w:hAnsi="Times New Roman" w:cs="Times New Roman"/>
+          <w:b/>
+          <w:bCs/>
+          <w:kern w:val="0"/>
+          <w:sz w:val="36"/>
+          <w:szCs w:val="36"/>
+          <w:lang w:val="en-US" w:eastAsia="nb-NO"/>
+          <w14:ligatures w14:val="none"/>
+        </w:rPr>
+        <w:t xml:space="preserve">: </w:t>
+      </w:r>
+      <w:r>
+        <w:rPr>
+          <w:rFonts w:ascii="Times New Roman" w:eastAsiaTheme="majorEastAsia" w:hAnsi="Times New Roman" w:cs="Times New Roman"/>
+          <w:b/>
+          <w:bCs/>
+          <w:kern w:val="0"/>
+          <w:sz w:val="36"/>
+          <w:szCs w:val="36"/>
+          <w:lang w:val="en-US" w:eastAsia="nb-NO"/>
+          <w14:ligatures w14:val="none"/>
+        </w:rPr>
         <w:t>Multicast</w:t>
+      </w:r>
+    </w:p>
+    <w:p>
+      <w:pPr>
+        <w:rPr>
+          <w:lang w:val="en-US" w:eastAsia="nb-NO"/>
+        </w:rPr>
+      </w:pPr>
+      <w:r>
+        <w:rPr>
+          <w:b/>
+          <w:bCs/>
+          <w:u w:val="single"/>
+          <w:lang w:val="en-US" w:eastAsia="nb-NO"/>
+        </w:rPr>
+        <w:t>Subtask 1:</w:t>
+      </w:r>
+      <w:r>
+        <w:rPr>
+          <w:lang w:val="en-US" w:eastAsia="nb-NO"/>
+        </w:rPr>
+        <w:t xml:space="preserve"> Reproduce Figures 6 and 7</w:t>
+      </w:r>
+    </w:p>
+    <w:p>
+      <w:pPr>
+        <w:rPr>
+          <w:lang w:val="en-US" w:eastAsia="nb-NO"/>
+        </w:rPr>
+      </w:pPr>
+      <w:r>
+        <w:rPr>
+          <w:b/>
+          <w:bCs/>
+          <w:u w:val="single"/>
+          <w:lang w:val="en-US" w:eastAsia="nb-NO"/>
+        </w:rPr>
+        <w:lastRenderedPageBreak/>
+        <w:t>Subtask 2:</w:t>
+      </w:r>
+      <w:r>
+        <w:rPr>
+          <w:lang w:val="en-US" w:eastAsia="nb-NO"/>
+        </w:rPr>
+        <w:t xml:space="preserve"> Can we setup</w:t>
+      </w:r>
+      <w:r>
+        <w:rPr>
+          <w:lang w:val="en-US" w:eastAsia="nb-NO"/>
+        </w:rPr>
+        <w:t xml:space="preserve"> multiple senders in the same way with setting multiple receivers? Explain why and why not.</w:t>
       </w:r>
     </w:p>
     <w:sectPr>
@@ -492,11 +1166,6 @@
         <w:docPartUnique/>
       </w:docPartObj>
     </w:sdtPr>
-    <w:sdtEndPr>
-      <w:rPr>
-        <w:rStyle w:val="Sidetall"/>
-      </w:rPr>
-    </w:sdtEndPr>
     <w:sdtContent>
       <w:p>
         <w:pPr>
@@ -555,11 +1224,6 @@
         <w:docPartUnique/>
       </w:docPartObj>
     </w:sdtPr>
-    <w:sdtEndPr>
-      <w:rPr>
-        <w:rStyle w:val="Sidetall"/>
-      </w:rPr>
-    </w:sdtEndPr>
     <w:sdtContent>
       <w:p>
         <w:pPr>
@@ -730,6 +1394,118 @@
     </w:lvl>
   </w:abstractNum>
   <w:abstractNum w:abstractNumId="1" w15:restartNumberingAfterBreak="0">
+    <w:nsid w:val="067A232C"/>
+    <w:multiLevelType w:val="hybridMultilevel"/>
+    <w:tmpl w:val="57F6FFF4"/>
+    <w:lvl w:ilvl="0" w:tplc="0032E560">
+      <w:numFmt w:val="bullet"/>
+      <w:lvlText w:val="-"/>
+      <w:lvlJc w:val="left"/>
+      <w:pPr>
+        <w:ind w:left="720" w:hanging="360"/>
+      </w:pPr>
+      <w:rPr>
+        <w:rFonts w:ascii="Aptos" w:eastAsiaTheme="minorHAnsi" w:hAnsi="Aptos" w:cstheme="minorBidi" w:hint="default"/>
+      </w:rPr>
+    </w:lvl>
+    <w:lvl w:ilvl="1" w:tplc="04140003" w:tentative="1">
+      <w:start w:val="1"/>
+      <w:numFmt w:val="bullet"/>
+      <w:lvlText w:val="o"/>
+      <w:lvlJc w:val="left"/>
+      <w:pPr>
+        <w:ind w:left="1440" w:hanging="360"/>
+      </w:pPr>
+      <w:rPr>
+        <w:rFonts w:ascii="Courier New" w:hAnsi="Courier New" w:cs="Courier New" w:hint="default"/>
+      </w:rPr>
+    </w:lvl>
+    <w:lvl w:ilvl="2" w:tplc="04140005" w:tentative="1">
+      <w:start w:val="1"/>
+      <w:numFmt w:val="bullet"/>
+      <w:lvlText w:val=""/>
+      <w:lvlJc w:val="left"/>
+      <w:pPr>
+        <w:ind w:left="2160" w:hanging="360"/>
+      </w:pPr>
+      <w:rPr>
+        <w:rFonts w:ascii="Wingdings" w:hAnsi="Wingdings" w:hint="default"/>
+      </w:rPr>
+    </w:lvl>
+    <w:lvl w:ilvl="3" w:tplc="04140001" w:tentative="1">
+      <w:start w:val="1"/>
+      <w:numFmt w:val="bullet"/>
+      <w:lvlText w:val=""/>
+      <w:lvlJc w:val="left"/>
+      <w:pPr>
+        <w:ind w:left="2880" w:hanging="360"/>
+      </w:pPr>
+      <w:rPr>
+        <w:rFonts w:ascii="Symbol" w:hAnsi="Symbol" w:hint="default"/>
+      </w:rPr>
+    </w:lvl>
+    <w:lvl w:ilvl="4" w:tplc="04140003" w:tentative="1">
+      <w:start w:val="1"/>
+      <w:numFmt w:val="bullet"/>
+      <w:lvlText w:val="o"/>
+      <w:lvlJc w:val="left"/>
+      <w:pPr>
+        <w:ind w:left="3600" w:hanging="360"/>
+      </w:pPr>
+      <w:rPr>
+        <w:rFonts w:ascii="Courier New" w:hAnsi="Courier New" w:cs="Courier New" w:hint="default"/>
+      </w:rPr>
+    </w:lvl>
+    <w:lvl w:ilvl="5" w:tplc="04140005" w:tentative="1">
+      <w:start w:val="1"/>
+      <w:numFmt w:val="bullet"/>
+      <w:lvlText w:val=""/>
+      <w:lvlJc w:val="left"/>
+      <w:pPr>
+        <w:ind w:left="4320" w:hanging="360"/>
+      </w:pPr>
+      <w:rPr>
+        <w:rFonts w:ascii="Wingdings" w:hAnsi="Wingdings" w:hint="default"/>
+      </w:rPr>
+    </w:lvl>
+    <w:lvl w:ilvl="6" w:tplc="04140001" w:tentative="1">
+      <w:start w:val="1"/>
+      <w:numFmt w:val="bullet"/>
+      <w:lvlText w:val=""/>
+      <w:lvlJc w:val="left"/>
+      <w:pPr>
+        <w:ind w:left="5040" w:hanging="360"/>
+      </w:pPr>
+      <w:rPr>
+        <w:rFonts w:ascii="Symbol" w:hAnsi="Symbol" w:hint="default"/>
+      </w:rPr>
+    </w:lvl>
+    <w:lvl w:ilvl="7" w:tplc="04140003" w:tentative="1">
+      <w:start w:val="1"/>
+      <w:numFmt w:val="bullet"/>
+      <w:lvlText w:val="o"/>
+      <w:lvlJc w:val="left"/>
+      <w:pPr>
+        <w:ind w:left="5760" w:hanging="360"/>
+      </w:pPr>
+      <w:rPr>
+        <w:rFonts w:ascii="Courier New" w:hAnsi="Courier New" w:cs="Courier New" w:hint="default"/>
+      </w:rPr>
+    </w:lvl>
+    <w:lvl w:ilvl="8" w:tplc="04140005" w:tentative="1">
+      <w:start w:val="1"/>
+      <w:numFmt w:val="bullet"/>
+      <w:lvlText w:val=""/>
+      <w:lvlJc w:val="left"/>
+      <w:pPr>
+        <w:ind w:left="6480" w:hanging="360"/>
+      </w:pPr>
+      <w:rPr>
+        <w:rFonts w:ascii="Wingdings" w:hAnsi="Wingdings" w:hint="default"/>
+      </w:rPr>
+    </w:lvl>
+  </w:abstractNum>
+  <w:abstractNum w:abstractNumId="2" w15:restartNumberingAfterBreak="0">
     <w:nsid w:val="12167D6C"/>
     <w:multiLevelType w:val="hybridMultilevel"/>
     <w:tmpl w:val="A1B6485C"/>
@@ -841,7 +1617,7 @@
       </w:rPr>
     </w:lvl>
   </w:abstractNum>
-  <w:abstractNum w:abstractNumId="2" w15:restartNumberingAfterBreak="0">
+  <w:abstractNum w:abstractNumId="3" w15:restartNumberingAfterBreak="0">
     <w:nsid w:val="130E3939"/>
     <w:multiLevelType w:val="multilevel"/>
     <w:tmpl w:val="FAA430A6"/>
@@ -954,7 +1730,7 @@
       </w:pPr>
     </w:lvl>
   </w:abstractNum>
-  <w:abstractNum w:abstractNumId="3" w15:restartNumberingAfterBreak="0">
+  <w:abstractNum w:abstractNumId="4" w15:restartNumberingAfterBreak="0">
     <w:nsid w:val="16EB7549"/>
     <w:multiLevelType w:val="hybridMultilevel"/>
     <w:tmpl w:val="DC6225C0"/>
@@ -1066,7 +1842,7 @@
       </w:rPr>
     </w:lvl>
   </w:abstractNum>
-  <w:abstractNum w:abstractNumId="4" w15:restartNumberingAfterBreak="0">
+  <w:abstractNum w:abstractNumId="5" w15:restartNumberingAfterBreak="0">
     <w:nsid w:val="17B76EDA"/>
     <w:multiLevelType w:val="multilevel"/>
     <w:tmpl w:val="BF0CBAB8"/>
@@ -1179,7 +1955,7 @@
       </w:pPr>
     </w:lvl>
   </w:abstractNum>
-  <w:abstractNum w:abstractNumId="5" w15:restartNumberingAfterBreak="0">
+  <w:abstractNum w:abstractNumId="6" w15:restartNumberingAfterBreak="0">
     <w:nsid w:val="1D061BB9"/>
     <w:multiLevelType w:val="hybridMultilevel"/>
     <w:tmpl w:val="38E2C3F8"/>
@@ -1291,7 +2067,121 @@
       </w:rPr>
     </w:lvl>
   </w:abstractNum>
-  <w:abstractNum w:abstractNumId="6" w15:restartNumberingAfterBreak="0">
+  <w:abstractNum w:abstractNumId="7" w15:restartNumberingAfterBreak="0">
+    <w:nsid w:val="21FB45DF"/>
+    <w:multiLevelType w:val="hybridMultilevel"/>
+    <w:tmpl w:val="12F21D70"/>
+    <w:lvl w:ilvl="0" w:tplc="9F0E4DB8">
+      <w:numFmt w:val="bullet"/>
+      <w:lvlText w:val="-"/>
+      <w:lvlJc w:val="left"/>
+      <w:pPr>
+        <w:ind w:left="720" w:hanging="360"/>
+      </w:pPr>
+      <w:rPr>
+        <w:rFonts w:ascii="Aptos" w:eastAsiaTheme="minorHAnsi" w:hAnsi="Aptos" w:cstheme="minorBidi" w:hint="default"/>
+        <w:b w:val="0"/>
+        <w:sz w:val="24"/>
+      </w:rPr>
+    </w:lvl>
+    <w:lvl w:ilvl="1" w:tplc="04140003" w:tentative="1">
+      <w:start w:val="1"/>
+      <w:numFmt w:val="bullet"/>
+      <w:lvlText w:val="o"/>
+      <w:lvlJc w:val="left"/>
+      <w:pPr>
+        <w:ind w:left="1440" w:hanging="360"/>
+      </w:pPr>
+      <w:rPr>
+        <w:rFonts w:ascii="Courier New" w:hAnsi="Courier New" w:cs="Courier New" w:hint="default"/>
+      </w:rPr>
+    </w:lvl>
+    <w:lvl w:ilvl="2" w:tplc="04140005" w:tentative="1">
+      <w:start w:val="1"/>
+      <w:numFmt w:val="bullet"/>
+      <w:lvlText w:val=""/>
+      <w:lvlJc w:val="left"/>
+      <w:pPr>
+        <w:ind w:left="2160" w:hanging="360"/>
+      </w:pPr>
+      <w:rPr>
+        <w:rFonts w:ascii="Wingdings" w:hAnsi="Wingdings" w:hint="default"/>
+      </w:rPr>
+    </w:lvl>
+    <w:lvl w:ilvl="3" w:tplc="04140001" w:tentative="1">
+      <w:start w:val="1"/>
+      <w:numFmt w:val="bullet"/>
+      <w:lvlText w:val=""/>
+      <w:lvlJc w:val="left"/>
+      <w:pPr>
+        <w:ind w:left="2880" w:hanging="360"/>
+      </w:pPr>
+      <w:rPr>
+        <w:rFonts w:ascii="Symbol" w:hAnsi="Symbol" w:hint="default"/>
+      </w:rPr>
+    </w:lvl>
+    <w:lvl w:ilvl="4" w:tplc="04140003" w:tentative="1">
+      <w:start w:val="1"/>
+      <w:numFmt w:val="bullet"/>
+      <w:lvlText w:val="o"/>
+      <w:lvlJc w:val="left"/>
+      <w:pPr>
+        <w:ind w:left="3600" w:hanging="360"/>
+      </w:pPr>
+      <w:rPr>
+        <w:rFonts w:ascii="Courier New" w:hAnsi="Courier New" w:cs="Courier New" w:hint="default"/>
+      </w:rPr>
+    </w:lvl>
+    <w:lvl w:ilvl="5" w:tplc="04140005" w:tentative="1">
+      <w:start w:val="1"/>
+      <w:numFmt w:val="bullet"/>
+      <w:lvlText w:val=""/>
+      <w:lvlJc w:val="left"/>
+      <w:pPr>
+        <w:ind w:left="4320" w:hanging="360"/>
+      </w:pPr>
+      <w:rPr>
+        <w:rFonts w:ascii="Wingdings" w:hAnsi="Wingdings" w:hint="default"/>
+      </w:rPr>
+    </w:lvl>
+    <w:lvl w:ilvl="6" w:tplc="04140001" w:tentative="1">
+      <w:start w:val="1"/>
+      <w:numFmt w:val="bullet"/>
+      <w:lvlText w:val=""/>
+      <w:lvlJc w:val="left"/>
+      <w:pPr>
+        <w:ind w:left="5040" w:hanging="360"/>
+      </w:pPr>
+      <w:rPr>
+        <w:rFonts w:ascii="Symbol" w:hAnsi="Symbol" w:hint="default"/>
+      </w:rPr>
+    </w:lvl>
+    <w:lvl w:ilvl="7" w:tplc="04140003" w:tentative="1">
+      <w:start w:val="1"/>
+      <w:numFmt w:val="bullet"/>
+      <w:lvlText w:val="o"/>
+      <w:lvlJc w:val="left"/>
+      <w:pPr>
+        <w:ind w:left="5760" w:hanging="360"/>
+      </w:pPr>
+      <w:rPr>
+        <w:rFonts w:ascii="Courier New" w:hAnsi="Courier New" w:cs="Courier New" w:hint="default"/>
+      </w:rPr>
+    </w:lvl>
+    <w:lvl w:ilvl="8" w:tplc="04140005" w:tentative="1">
+      <w:start w:val="1"/>
+      <w:numFmt w:val="bullet"/>
+      <w:lvlText w:val=""/>
+      <w:lvlJc w:val="left"/>
+      <w:pPr>
+        <w:ind w:left="6480" w:hanging="360"/>
+      </w:pPr>
+      <w:rPr>
+        <w:rFonts w:ascii="Wingdings" w:hAnsi="Wingdings" w:hint="default"/>
+      </w:rPr>
+    </w:lvl>
+  </w:abstractNum>
+  <w:abstractNum w:abstractNumId="8" w15:restartNumberingAfterBreak="0">
     <w:nsid w:val="24A75890"/>
     <w:multiLevelType w:val="multilevel"/>
     <w:tmpl w:val="E4BA41EC"/>
@@ -1405,7 +2295,7 @@
       </w:rPr>
     </w:lvl>
   </w:abstractNum>
-  <w:abstractNum w:abstractNumId="7" w15:restartNumberingAfterBreak="0">
+  <w:abstractNum w:abstractNumId="9" w15:restartNumberingAfterBreak="0">
     <w:nsid w:val="2CF60C80"/>
     <w:multiLevelType w:val="hybridMultilevel"/>
     <w:tmpl w:val="AA4004E0"/>
@@ -1517,7 +2407,7 @@
       </w:rPr>
     </w:lvl>
   </w:abstractNum>
-  <w:abstractNum w:abstractNumId="8" w15:restartNumberingAfterBreak="0">
+  <w:abstractNum w:abstractNumId="10" w15:restartNumberingAfterBreak="0">
     <w:nsid w:val="2F563318"/>
     <w:multiLevelType w:val="multilevel"/>
     <w:tmpl w:val="95B6D4F4"/>
@@ -1631,7 +2521,119 @@
       </w:pPr>
     </w:lvl>
   </w:abstractNum>
-  <w:abstractNum w:abstractNumId="9" w15:restartNumberingAfterBreak="0">
+  <w:abstractNum w:abstractNumId="11" w15:restartNumberingAfterBreak="0">
+    <w:nsid w:val="31496BA2"/>
+    <w:multiLevelType w:val="hybridMultilevel"/>
+    <w:tmpl w:val="965E3EDA"/>
+    <w:lvl w:ilvl="0" w:tplc="AA5C2EF4">
+      <w:numFmt w:val="bullet"/>
+      <w:lvlText w:val="-"/>
+      <w:lvlJc w:val="left"/>
+      <w:pPr>
+        <w:ind w:left="720" w:hanging="360"/>
+      </w:pPr>
+      <w:rPr>
+        <w:rFonts w:ascii="Aptos" w:eastAsiaTheme="minorHAnsi" w:hAnsi="Aptos" w:cstheme="minorBidi" w:hint="default"/>
+      </w:rPr>
+    </w:lvl>
+    <w:lvl w:ilvl="1" w:tplc="04140003" w:tentative="1">
+      <w:start w:val="1"/>
+      <w:numFmt w:val="bullet"/>
+      <w:lvlText w:val="o"/>
+      <w:lvlJc w:val="left"/>
+      <w:pPr>
+        <w:ind w:left="1440" w:hanging="360"/>
+      </w:pPr>
+      <w:rPr>
+        <w:rFonts w:ascii="Courier New" w:hAnsi="Courier New" w:cs="Courier New" w:hint="default"/>
+      </w:rPr>
+    </w:lvl>
+    <w:lvl w:ilvl="2" w:tplc="04140005" w:tentative="1">
+      <w:start w:val="1"/>
+      <w:numFmt w:val="bullet"/>
+      <w:lvlText w:val=""/>
+      <w:lvlJc w:val="left"/>
+      <w:pPr>
+        <w:ind w:left="2160" w:hanging="360"/>
+      </w:pPr>
+      <w:rPr>
+        <w:rFonts w:ascii="Wingdings" w:hAnsi="Wingdings" w:hint="default"/>
+      </w:rPr>
+    </w:lvl>
+    <w:lvl w:ilvl="3" w:tplc="04140001" w:tentative="1">
+      <w:start w:val="1"/>
+      <w:numFmt w:val="bullet"/>
+      <w:lvlText w:val=""/>
+      <w:lvlJc w:val="left"/>
+      <w:pPr>
+        <w:ind w:left="2880" w:hanging="360"/>
+      </w:pPr>
+      <w:rPr>
+        <w:rFonts w:ascii="Symbol" w:hAnsi="Symbol" w:hint="default"/>
+      </w:rPr>
+    </w:lvl>
+    <w:lvl w:ilvl="4" w:tplc="04140003" w:tentative="1">
+      <w:start w:val="1"/>
+      <w:numFmt w:val="bullet"/>
+      <w:lvlText w:val="o"/>
+      <w:lvlJc w:val="left"/>
+      <w:pPr>
+        <w:ind w:left="3600" w:hanging="360"/>
+      </w:pPr>
+      <w:rPr>
+        <w:rFonts w:ascii="Courier New" w:hAnsi="Courier New" w:cs="Courier New" w:hint="default"/>
+      </w:rPr>
+    </w:lvl>
+    <w:lvl w:ilvl="5" w:tplc="04140005" w:tentative="1">
+      <w:start w:val="1"/>
+      <w:numFmt w:val="bullet"/>
+      <w:lvlText w:val=""/>
+      <w:lvlJc w:val="left"/>
+      <w:pPr>
+        <w:ind w:left="4320" w:hanging="360"/>
+      </w:pPr>
+      <w:rPr>
+        <w:rFonts w:ascii="Wingdings" w:hAnsi="Wingdings" w:hint="default"/>
+      </w:rPr>
+    </w:lvl>
+    <w:lvl w:ilvl="6" w:tplc="04140001" w:tentative="1">
+      <w:start w:val="1"/>
+      <w:numFmt w:val="bullet"/>
+      <w:lvlText w:val=""/>
+      <w:lvlJc w:val="left"/>
+      <w:pPr>
+        <w:ind w:left="5040" w:hanging="360"/>
+      </w:pPr>
+      <w:rPr>
+        <w:rFonts w:ascii="Symbol" w:hAnsi="Symbol" w:hint="default"/>
+      </w:rPr>
+    </w:lvl>
+    <w:lvl w:ilvl="7" w:tplc="04140003" w:tentative="1">
+      <w:start w:val="1"/>
+      <w:numFmt w:val="bullet"/>
+      <w:lvlText w:val="o"/>
+      <w:lvlJc w:val="left"/>
+      <w:pPr>
+        <w:ind w:left="5760" w:hanging="360"/>
+      </w:pPr>
+      <w:rPr>
+        <w:rFonts w:ascii="Courier New" w:hAnsi="Courier New" w:cs="Courier New" w:hint="default"/>
+      </w:rPr>
+    </w:lvl>
+    <w:lvl w:ilvl="8" w:tplc="04140005" w:tentative="1">
+      <w:start w:val="1"/>
+      <w:numFmt w:val="bullet"/>
+      <w:lvlText w:val=""/>
+      <w:lvlJc w:val="left"/>
+      <w:pPr>
+        <w:ind w:left="6480" w:hanging="360"/>
+      </w:pPr>
+      <w:rPr>
+        <w:rFonts w:ascii="Wingdings" w:hAnsi="Wingdings" w:hint="default"/>
+      </w:rPr>
+    </w:lvl>
+  </w:abstractNum>
+  <w:abstractNum w:abstractNumId="12" w15:restartNumberingAfterBreak="0">
     <w:nsid w:val="33F33B05"/>
     <w:multiLevelType w:val="multilevel"/>
     <w:tmpl w:val="00BA5B72"/>
@@ -1744,7 +2746,7 @@
       </w:rPr>
     </w:lvl>
   </w:abstractNum>
-  <w:abstractNum w:abstractNumId="10" w15:restartNumberingAfterBreak="0">
+  <w:abstractNum w:abstractNumId="13" w15:restartNumberingAfterBreak="0">
     <w:nsid w:val="354B314B"/>
     <w:multiLevelType w:val="hybridMultilevel"/>
     <w:tmpl w:val="F2543798"/>
@@ -1833,7 +2835,7 @@
       </w:pPr>
     </w:lvl>
   </w:abstractNum>
-  <w:abstractNum w:abstractNumId="11" w15:restartNumberingAfterBreak="0">
+  <w:abstractNum w:abstractNumId="14" w15:restartNumberingAfterBreak="0">
     <w:nsid w:val="4AA3097C"/>
     <w:multiLevelType w:val="hybridMultilevel"/>
     <w:tmpl w:val="38009FD8"/>
@@ -1945,7 +2947,7 @@
       </w:rPr>
     </w:lvl>
   </w:abstractNum>
-  <w:abstractNum w:abstractNumId="12" w15:restartNumberingAfterBreak="0">
+  <w:abstractNum w:abstractNumId="15" w15:restartNumberingAfterBreak="0">
     <w:nsid w:val="54451AB2"/>
     <w:multiLevelType w:val="multilevel"/>
     <w:tmpl w:val="4F223346"/>
@@ -2058,7 +3060,7 @@
       </w:rPr>
     </w:lvl>
   </w:abstractNum>
-  <w:abstractNum w:abstractNumId="13" w15:restartNumberingAfterBreak="0">
+  <w:abstractNum w:abstractNumId="16" w15:restartNumberingAfterBreak="0">
     <w:nsid w:val="54FA350F"/>
     <w:multiLevelType w:val="multilevel"/>
     <w:tmpl w:val="8100538E"/>
@@ -2171,7 +3173,7 @@
       </w:rPr>
     </w:lvl>
   </w:abstractNum>
-  <w:abstractNum w:abstractNumId="14" w15:restartNumberingAfterBreak="0">
+  <w:abstractNum w:abstractNumId="17" w15:restartNumberingAfterBreak="0">
     <w:nsid w:val="58A4597A"/>
     <w:multiLevelType w:val="hybridMultilevel"/>
     <w:tmpl w:val="55D8B7F2"/>
@@ -2283,7 +3285,7 @@
       </w:rPr>
     </w:lvl>
   </w:abstractNum>
-  <w:abstractNum w:abstractNumId="15" w15:restartNumberingAfterBreak="0">
+  <w:abstractNum w:abstractNumId="18" w15:restartNumberingAfterBreak="0">
     <w:nsid w:val="5AD27183"/>
     <w:multiLevelType w:val="hybridMultilevel"/>
     <w:tmpl w:val="BB58D052"/>
@@ -2395,7 +3397,7 @@
       </w:rPr>
     </w:lvl>
   </w:abstractNum>
-  <w:abstractNum w:abstractNumId="16" w15:restartNumberingAfterBreak="0">
+  <w:abstractNum w:abstractNumId="19" w15:restartNumberingAfterBreak="0">
     <w:nsid w:val="5B145DAD"/>
     <w:multiLevelType w:val="multilevel"/>
     <w:tmpl w:val="F6FA8DC0"/>
@@ -2508,7 +3510,7 @@
       </w:pPr>
     </w:lvl>
   </w:abstractNum>
-  <w:abstractNum w:abstractNumId="17" w15:restartNumberingAfterBreak="0">
+  <w:abstractNum w:abstractNumId="20" w15:restartNumberingAfterBreak="0">
     <w:nsid w:val="65692C21"/>
     <w:multiLevelType w:val="multilevel"/>
     <w:tmpl w:val="6DBC67E4"/>
@@ -2621,7 +3623,119 @@
       </w:rPr>
     </w:lvl>
   </w:abstractNum>
-  <w:abstractNum w:abstractNumId="18" w15:restartNumberingAfterBreak="0">
+  <w:abstractNum w:abstractNumId="21" w15:restartNumberingAfterBreak="0">
+    <w:nsid w:val="7C6465F9"/>
+    <w:multiLevelType w:val="hybridMultilevel"/>
+    <w:tmpl w:val="F82EBC96"/>
+    <w:lvl w:ilvl="0" w:tplc="CB9C9544">
+      <w:numFmt w:val="bullet"/>
+      <w:lvlText w:val="-"/>
+      <w:lvlJc w:val="left"/>
+      <w:pPr>
+        <w:ind w:left="720" w:hanging="360"/>
+      </w:pPr>
+      <w:rPr>
+        <w:rFonts w:ascii="Aptos" w:eastAsiaTheme="minorHAnsi" w:hAnsi="Aptos" w:cstheme="minorBidi" w:hint="default"/>
+      </w:rPr>
+    </w:lvl>
+    <w:lvl w:ilvl="1" w:tplc="04140003" w:tentative="1">
+      <w:start w:val="1"/>
+      <w:numFmt w:val="bullet"/>
+      <w:lvlText w:val="o"/>
+      <w:lvlJc w:val="left"/>
+      <w:pPr>
+        <w:ind w:left="1440" w:hanging="360"/>
+      </w:pPr>
+      <w:rPr>
+        <w:rFonts w:ascii="Courier New" w:hAnsi="Courier New" w:cs="Courier New" w:hint="default"/>
+      </w:rPr>
+    </w:lvl>
+    <w:lvl w:ilvl="2" w:tplc="04140005" w:tentative="1">
+      <w:start w:val="1"/>
+      <w:numFmt w:val="bullet"/>
+      <w:lvlText w:val=""/>
+      <w:lvlJc w:val="left"/>
+      <w:pPr>
+        <w:ind w:left="2160" w:hanging="360"/>
+      </w:pPr>
+      <w:rPr>
+        <w:rFonts w:ascii="Wingdings" w:hAnsi="Wingdings" w:hint="default"/>
+      </w:rPr>
+    </w:lvl>
+    <w:lvl w:ilvl="3" w:tplc="04140001" w:tentative="1">
+      <w:start w:val="1"/>
+      <w:numFmt w:val="bullet"/>
+      <w:lvlText w:val=""/>
+      <w:lvlJc w:val="left"/>
+      <w:pPr>
+        <w:ind w:left="2880" w:hanging="360"/>
+      </w:pPr>
+      <w:rPr>
+        <w:rFonts w:ascii="Symbol" w:hAnsi="Symbol" w:hint="default"/>
+      </w:rPr>
+    </w:lvl>
+    <w:lvl w:ilvl="4" w:tplc="04140003" w:tentative="1">
+      <w:start w:val="1"/>
+      <w:numFmt w:val="bullet"/>
+      <w:lvlText w:val="o"/>
+      <w:lvlJc w:val="left"/>
+      <w:pPr>
+        <w:ind w:left="3600" w:hanging="360"/>
+      </w:pPr>
+      <w:rPr>
+        <w:rFonts w:ascii="Courier New" w:hAnsi="Courier New" w:cs="Courier New" w:hint="default"/>
+      </w:rPr>
+    </w:lvl>
+    <w:lvl w:ilvl="5" w:tplc="04140005" w:tentative="1">
+      <w:start w:val="1"/>
+      <w:numFmt w:val="bullet"/>
+      <w:lvlText w:val=""/>
+      <w:lvlJc w:val="left"/>
+      <w:pPr>
+        <w:ind w:left="4320" w:hanging="360"/>
+      </w:pPr>
+      <w:rPr>
+        <w:rFonts w:ascii="Wingdings" w:hAnsi="Wingdings" w:hint="default"/>
+      </w:rPr>
+    </w:lvl>
+    <w:lvl w:ilvl="6" w:tplc="04140001" w:tentative="1">
+      <w:start w:val="1"/>
+      <w:numFmt w:val="bullet"/>
+      <w:lvlText w:val=""/>
+      <w:lvlJc w:val="left"/>
+      <w:pPr>
+        <w:ind w:left="5040" w:hanging="360"/>
+      </w:pPr>
+      <w:rPr>
+        <w:rFonts w:ascii="Symbol" w:hAnsi="Symbol" w:hint="default"/>
+      </w:rPr>
+    </w:lvl>
+    <w:lvl w:ilvl="7" w:tplc="04140003" w:tentative="1">
+      <w:start w:val="1"/>
+      <w:numFmt w:val="bullet"/>
+      <w:lvlText w:val="o"/>
+      <w:lvlJc w:val="left"/>
+      <w:pPr>
+        <w:ind w:left="5760" w:hanging="360"/>
+      </w:pPr>
+      <w:rPr>
+        <w:rFonts w:ascii="Courier New" w:hAnsi="Courier New" w:cs="Courier New" w:hint="default"/>
+      </w:rPr>
+    </w:lvl>
+    <w:lvl w:ilvl="8" w:tplc="04140005" w:tentative="1">
+      <w:start w:val="1"/>
+      <w:numFmt w:val="bullet"/>
+      <w:lvlText w:val=""/>
+      <w:lvlJc w:val="left"/>
+      <w:pPr>
+        <w:ind w:left="6480" w:hanging="360"/>
+      </w:pPr>
+      <w:rPr>
+        <w:rFonts w:ascii="Wingdings" w:hAnsi="Wingdings" w:hint="default"/>
+      </w:rPr>
+    </w:lvl>
+  </w:abstractNum>
+  <w:abstractNum w:abstractNumId="22" w15:restartNumberingAfterBreak="0">
     <w:nsid w:val="7E8633CB"/>
     <w:multiLevelType w:val="multilevel"/>
     <w:tmpl w:val="D3F27AD2"/>
@@ -2735,31 +3849,31 @@
     </w:lvl>
   </w:abstractNum>
   <w:num w:numId="1" w16cid:durableId="1442652110">
-    <w:abstractNumId w:val="18"/>
+    <w:abstractNumId w:val="22"/>
   </w:num>
   <w:num w:numId="2" w16cid:durableId="1060447681">
-    <w:abstractNumId w:val="9"/>
+    <w:abstractNumId w:val="12"/>
   </w:num>
   <w:num w:numId="3" w16cid:durableId="1708601671">
-    <w:abstractNumId w:val="9"/>
+    <w:abstractNumId w:val="12"/>
   </w:num>
   <w:num w:numId="4" w16cid:durableId="1803303132">
-    <w:abstractNumId w:val="17"/>
+    <w:abstractNumId w:val="20"/>
   </w:num>
   <w:num w:numId="5" w16cid:durableId="1697074110">
-    <w:abstractNumId w:val="12"/>
+    <w:abstractNumId w:val="15"/>
   </w:num>
   <w:num w:numId="6" w16cid:durableId="1528252287">
-    <w:abstractNumId w:val="6"/>
+    <w:abstractNumId w:val="8"/>
   </w:num>
   <w:num w:numId="7" w16cid:durableId="105662357">
-    <w:abstractNumId w:val="6"/>
+    <w:abstractNumId w:val="8"/>
   </w:num>
   <w:num w:numId="8" w16cid:durableId="1629508395">
-    <w:abstractNumId w:val="2"/>
+    <w:abstractNumId w:val="3"/>
   </w:num>
   <w:num w:numId="9" w16cid:durableId="1576014410">
-    <w:abstractNumId w:val="2"/>
+    <w:abstractNumId w:val="3"/>
     <w:lvlOverride w:ilvl="0">
       <w:startOverride w:val="1"/>
     </w:lvlOverride>
@@ -2789,46 +3903,58 @@
     </w:lvlOverride>
   </w:num>
   <w:num w:numId="10" w16cid:durableId="1226069016">
-    <w:abstractNumId w:val="13"/>
+    <w:abstractNumId w:val="16"/>
   </w:num>
   <w:num w:numId="11" w16cid:durableId="126748389">
-    <w:abstractNumId w:val="13"/>
+    <w:abstractNumId w:val="16"/>
   </w:num>
   <w:num w:numId="12" w16cid:durableId="976647430">
     <w:abstractNumId w:val="0"/>
   </w:num>
   <w:num w:numId="13" w16cid:durableId="653877564">
-    <w:abstractNumId w:val="8"/>
+    <w:abstractNumId w:val="10"/>
   </w:num>
   <w:num w:numId="14" w16cid:durableId="2062241591">
+    <w:abstractNumId w:val="17"/>
+  </w:num>
+  <w:num w:numId="15" w16cid:durableId="1838572655">
+    <w:abstractNumId w:val="9"/>
+  </w:num>
+  <w:num w:numId="16" w16cid:durableId="873347180">
+    <w:abstractNumId w:val="2"/>
+  </w:num>
+  <w:num w:numId="17" w16cid:durableId="600188363">
+    <w:abstractNumId w:val="6"/>
+  </w:num>
+  <w:num w:numId="18" w16cid:durableId="1992982122">
+    <w:abstractNumId w:val="4"/>
+  </w:num>
+  <w:num w:numId="19" w16cid:durableId="802889912">
     <w:abstractNumId w:val="14"/>
   </w:num>
-  <w:num w:numId="15" w16cid:durableId="1838572655">
+  <w:num w:numId="20" w16cid:durableId="1118180385">
+    <w:abstractNumId w:val="18"/>
+  </w:num>
+  <w:num w:numId="21" w16cid:durableId="1555387613">
+    <w:abstractNumId w:val="5"/>
+  </w:num>
+  <w:num w:numId="22" w16cid:durableId="1098334373">
+    <w:abstractNumId w:val="19"/>
+  </w:num>
+  <w:num w:numId="23" w16cid:durableId="608902125">
+    <w:abstractNumId w:val="13"/>
+  </w:num>
+  <w:num w:numId="24" w16cid:durableId="627394603">
     <w:abstractNumId w:val="7"/>
   </w:num>
-  <w:num w:numId="16" w16cid:durableId="873347180">
+  <w:num w:numId="25" w16cid:durableId="1729452194">
     <w:abstractNumId w:val="1"/>
   </w:num>
-  <w:num w:numId="17" w16cid:durableId="600188363">
-    <w:abstractNumId w:val="5"/>
-  </w:num>
-  <w:num w:numId="18" w16cid:durableId="1992982122">
-    <w:abstractNumId w:val="3"/>
-  </w:num>
-  <w:num w:numId="19" w16cid:durableId="802889912">
+  <w:num w:numId="26" w16cid:durableId="456876470">
     <w:abstractNumId w:val="11"/>
   </w:num>
-  <w:num w:numId="20" w16cid:durableId="1118180385">
-    <w:abstractNumId w:val="15"/>
-  </w:num>
-  <w:num w:numId="21" w16cid:durableId="1555387613">
-    <w:abstractNumId w:val="4"/>
-  </w:num>
-  <w:num w:numId="22" w16cid:durableId="1098334373">
-    <w:abstractNumId w:val="16"/>
-  </w:num>
-  <w:num w:numId="23" w16cid:durableId="608902125">
-    <w:abstractNumId w:val="10"/>
+  <w:num w:numId="27" w16cid:durableId="1678730652">
+    <w:abstractNumId w:val="21"/>
   </w:num>
 </w:numbering>
 </file>
@@ -3450,6 +4576,7 @@
   <w:style w:type="character" w:default="1" w:styleId="Standardskriftforavsnitt">
     <w:name w:val="Default Paragraph Font"/>
     <w:uiPriority w:val="1"/>
+    <w:semiHidden/>
     <w:unhideWhenUsed/>
   </w:style>
   <w:style w:type="table" w:default="1" w:styleId="Vanligtabell">

</xml_diff>

<commit_message>
lab11: started on exercise 2
</commit_message>
<xml_diff>
--- a/lab11/lab11_report.docx
+++ b/lab11/lab11_report.docx
@@ -354,12 +354,16 @@
         </w:numPr>
         <w:rPr>
           <w:rFonts w:ascii="Times New Roman" w:hAnsi="Times New Roman" w:cs="Times New Roman"/>
-          <w:lang w:val="en-US" w:eastAsia="nb-NO"/>
-        </w:rPr>
-      </w:pPr>
-      <w:r>
-        <w:rPr>
-          <w:rFonts w:ascii="Times New Roman" w:hAnsi="Times New Roman" w:cs="Times New Roman"/>
+          <w:b/>
+          <w:bCs/>
+          <w:lang w:val="en-US" w:eastAsia="nb-NO"/>
+        </w:rPr>
+      </w:pPr>
+      <w:r>
+        <w:rPr>
+          <w:rFonts w:ascii="Times New Roman" w:hAnsi="Times New Roman" w:cs="Times New Roman"/>
+          <w:b/>
+          <w:bCs/>
           <w:lang w:val="en-US" w:eastAsia="nb-NO"/>
         </w:rPr>
         <w:t>Subtask 1: Run code, include output:</w:t>
@@ -376,6 +380,7 @@
       <w:r>
         <w:rPr>
           <w:rFonts w:ascii="Times New Roman" w:hAnsi="Times New Roman" w:cs="Times New Roman"/>
+          <w:noProof/>
           <w:lang w:val="en-US" w:eastAsia="nb-NO"/>
         </w:rPr>
         <w:drawing>
@@ -424,12 +429,16 @@
         </w:numPr>
         <w:rPr>
           <w:rFonts w:ascii="Times New Roman" w:hAnsi="Times New Roman" w:cs="Times New Roman"/>
-          <w:lang w:val="en-US" w:eastAsia="nb-NO"/>
-        </w:rPr>
-      </w:pPr>
-      <w:r>
-        <w:rPr>
-          <w:rFonts w:ascii="Times New Roman" w:hAnsi="Times New Roman" w:cs="Times New Roman"/>
+          <w:b/>
+          <w:bCs/>
+          <w:lang w:val="en-US" w:eastAsia="nb-NO"/>
+        </w:rPr>
+      </w:pPr>
+      <w:r>
+        <w:rPr>
+          <w:rFonts w:ascii="Times New Roman" w:hAnsi="Times New Roman" w:cs="Times New Roman"/>
+          <w:b/>
+          <w:bCs/>
           <w:lang w:val="en-US" w:eastAsia="nb-NO"/>
         </w:rPr>
         <w:t>Subtask 2: Which class should run first?</w:t>
@@ -479,12 +488,16 @@
         </w:numPr>
         <w:rPr>
           <w:rFonts w:ascii="Times New Roman" w:hAnsi="Times New Roman" w:cs="Times New Roman"/>
-          <w:lang w:val="en-US" w:eastAsia="nb-NO"/>
-        </w:rPr>
-      </w:pPr>
-      <w:r>
-        <w:rPr>
-          <w:rFonts w:ascii="Times New Roman" w:hAnsi="Times New Roman" w:cs="Times New Roman"/>
+          <w:b/>
+          <w:bCs/>
+          <w:lang w:val="en-US" w:eastAsia="nb-NO"/>
+        </w:rPr>
+      </w:pPr>
+      <w:r>
+        <w:rPr>
+          <w:rFonts w:ascii="Times New Roman" w:hAnsi="Times New Roman" w:cs="Times New Roman"/>
+          <w:b/>
+          <w:bCs/>
           <w:lang w:val="en-US" w:eastAsia="nb-NO"/>
         </w:rPr>
         <w:t>Subtask</w:t>
@@ -492,6 +505,8 @@
       <w:r>
         <w:rPr>
           <w:rFonts w:ascii="Times New Roman" w:hAnsi="Times New Roman" w:cs="Times New Roman"/>
+          <w:b/>
+          <w:bCs/>
           <w:lang w:val="en-US" w:eastAsia="nb-NO"/>
         </w:rPr>
         <w:t xml:space="preserve"> </w:t>
@@ -499,6 +514,8 @@
       <w:r>
         <w:rPr>
           <w:rFonts w:ascii="Times New Roman" w:hAnsi="Times New Roman" w:cs="Times New Roman"/>
+          <w:b/>
+          <w:bCs/>
           <w:lang w:val="en-US" w:eastAsia="nb-NO"/>
         </w:rPr>
         <w:t>3:</w:t>
@@ -506,6 +523,8 @@
       <w:r>
         <w:rPr>
           <w:rFonts w:ascii="Times New Roman" w:hAnsi="Times New Roman" w:cs="Times New Roman"/>
+          <w:b/>
+          <w:bCs/>
           <w:lang w:val="en-US" w:eastAsia="nb-NO"/>
         </w:rPr>
         <w:t xml:space="preserve"> Which port number is used for Client, and which for Server?</w:t>
@@ -592,12 +611,16 @@
         </w:numPr>
         <w:rPr>
           <w:rFonts w:ascii="Times New Roman" w:hAnsi="Times New Roman" w:cs="Times New Roman"/>
-          <w:lang w:val="en-US" w:eastAsia="nb-NO"/>
-        </w:rPr>
-      </w:pPr>
-      <w:r>
-        <w:rPr>
-          <w:rFonts w:ascii="Times New Roman" w:hAnsi="Times New Roman" w:cs="Times New Roman"/>
+          <w:b/>
+          <w:bCs/>
+          <w:lang w:val="en-US" w:eastAsia="nb-NO"/>
+        </w:rPr>
+      </w:pPr>
+      <w:r>
+        <w:rPr>
+          <w:rFonts w:ascii="Times New Roman" w:hAnsi="Times New Roman" w:cs="Times New Roman"/>
+          <w:b/>
+          <w:bCs/>
           <w:lang w:val="en-US" w:eastAsia="nb-NO"/>
         </w:rPr>
         <w:t>Subtask 4: What is the IP address or hostname of Client and Server?</w:t>
@@ -660,23 +683,7 @@
           <w:rFonts w:ascii="Times New Roman" w:hAnsi="Times New Roman" w:cs="Times New Roman"/>
           <w:lang w:val="en-US" w:eastAsia="nb-NO"/>
         </w:rPr>
-        <w:t xml:space="preserve">Client </w:t>
-      </w:r>
-      <w:proofErr w:type="gramStart"/>
-      <w:r>
-        <w:rPr>
-          <w:rFonts w:ascii="Times New Roman" w:hAnsi="Times New Roman" w:cs="Times New Roman"/>
-          <w:lang w:val="en-US" w:eastAsia="nb-NO"/>
-        </w:rPr>
-        <w:t>is at</w:t>
-      </w:r>
-      <w:proofErr w:type="gramEnd"/>
-      <w:r>
-        <w:rPr>
-          <w:rFonts w:ascii="Times New Roman" w:hAnsi="Times New Roman" w:cs="Times New Roman"/>
-          <w:lang w:val="en-US" w:eastAsia="nb-NO"/>
-        </w:rPr>
-        <w:t xml:space="preserve"> 127.0.0.1:57526</w:t>
+        <w:t>Client is at 127.0.0.1:57526</w:t>
       </w:r>
     </w:p>
     <w:p>
@@ -709,12 +716,16 @@
         </w:numPr>
         <w:rPr>
           <w:rFonts w:ascii="Times New Roman" w:hAnsi="Times New Roman" w:cs="Times New Roman"/>
-          <w:lang w:val="en-US" w:eastAsia="nb-NO"/>
-        </w:rPr>
-      </w:pPr>
-      <w:r>
-        <w:rPr>
-          <w:rFonts w:ascii="Times New Roman" w:hAnsi="Times New Roman" w:cs="Times New Roman"/>
+          <w:b/>
+          <w:bCs/>
+          <w:lang w:val="en-US" w:eastAsia="nb-NO"/>
+        </w:rPr>
+      </w:pPr>
+      <w:r>
+        <w:rPr>
+          <w:rFonts w:ascii="Times New Roman" w:hAnsi="Times New Roman" w:cs="Times New Roman"/>
+          <w:b/>
+          <w:bCs/>
           <w:lang w:val="en-US" w:eastAsia="nb-NO"/>
         </w:rPr>
         <w:t>Subtask 5: Which line the Server opens the socket?</w:t>
@@ -849,14 +860,7 @@
           <w:rFonts w:ascii="Times New Roman" w:hAnsi="Times New Roman" w:cs="Times New Roman"/>
           <w:lang w:eastAsia="nb-NO"/>
         </w:rPr>
-        <w:t xml:space="preserve"> (line 8)</w:t>
-      </w:r>
-      <w:r>
-        <w:rPr>
-          <w:rFonts w:ascii="Times New Roman" w:hAnsi="Times New Roman" w:cs="Times New Roman"/>
-          <w:lang w:eastAsia="nb-NO"/>
-        </w:rPr>
-        <w:t>:</w:t>
+        <w:t xml:space="preserve"> (line 8):</w:t>
       </w:r>
     </w:p>
     <w:p>
@@ -925,47 +929,19 @@
         </w:numPr>
         <w:rPr>
           <w:rFonts w:ascii="Times New Roman" w:hAnsi="Times New Roman" w:cs="Times New Roman"/>
-          <w:lang w:val="en-US" w:eastAsia="nb-NO"/>
-        </w:rPr>
-      </w:pPr>
-      <w:r>
-        <w:rPr>
-          <w:rFonts w:ascii="Times New Roman" w:hAnsi="Times New Roman" w:cs="Times New Roman"/>
-          <w:lang w:val="en-US" w:eastAsia="nb-NO"/>
-        </w:rPr>
-        <w:t xml:space="preserve">Subtask 6: Which </w:t>
-      </w:r>
-      <w:proofErr w:type="gramStart"/>
-      <w:r>
-        <w:rPr>
-          <w:rFonts w:ascii="Times New Roman" w:hAnsi="Times New Roman" w:cs="Times New Roman"/>
-          <w:lang w:val="en-US" w:eastAsia="nb-NO"/>
-        </w:rPr>
-        <w:t>line</w:t>
-      </w:r>
-      <w:proofErr w:type="gramEnd"/>
-      <w:r>
-        <w:rPr>
-          <w:rFonts w:ascii="Times New Roman" w:hAnsi="Times New Roman" w:cs="Times New Roman"/>
-          <w:lang w:val="en-US" w:eastAsia="nb-NO"/>
-        </w:rPr>
-        <w:t xml:space="preserve"> the Server </w:t>
-      </w:r>
-      <w:proofErr w:type="gramStart"/>
-      <w:r>
-        <w:rPr>
-          <w:rFonts w:ascii="Times New Roman" w:hAnsi="Times New Roman" w:cs="Times New Roman"/>
-          <w:lang w:val="en-US" w:eastAsia="nb-NO"/>
-        </w:rPr>
-        <w:t>waits</w:t>
-      </w:r>
-      <w:proofErr w:type="gramEnd"/>
-      <w:r>
-        <w:rPr>
-          <w:rFonts w:ascii="Times New Roman" w:hAnsi="Times New Roman" w:cs="Times New Roman"/>
-          <w:lang w:val="en-US" w:eastAsia="nb-NO"/>
-        </w:rPr>
-        <w:t xml:space="preserve"> for Client?</w:t>
+          <w:b/>
+          <w:bCs/>
+          <w:lang w:val="en-US" w:eastAsia="nb-NO"/>
+        </w:rPr>
+      </w:pPr>
+      <w:r>
+        <w:rPr>
+          <w:rFonts w:ascii="Times New Roman" w:hAnsi="Times New Roman" w:cs="Times New Roman"/>
+          <w:b/>
+          <w:bCs/>
+          <w:lang w:val="en-US" w:eastAsia="nb-NO"/>
+        </w:rPr>
+        <w:t>Subtask 6: Which line the Server waits for Client?</w:t>
       </w:r>
     </w:p>
     <w:p>
@@ -1049,21 +1025,7 @@
           <w:rFonts w:ascii="Times New Roman" w:hAnsi="Times New Roman" w:cs="Times New Roman"/>
           <w:lang w:eastAsia="nb-NO"/>
         </w:rPr>
-        <w:t xml:space="preserve"> line</w:t>
-      </w:r>
-      <w:r>
-        <w:rPr>
-          <w:rFonts w:ascii="Times New Roman" w:hAnsi="Times New Roman" w:cs="Times New Roman"/>
-          <w:lang w:eastAsia="nb-NO"/>
-        </w:rPr>
-        <w:t xml:space="preserve"> (line 17)</w:t>
-      </w:r>
-      <w:r>
-        <w:rPr>
-          <w:rFonts w:ascii="Times New Roman" w:hAnsi="Times New Roman" w:cs="Times New Roman"/>
-          <w:lang w:eastAsia="nb-NO"/>
-        </w:rPr>
-        <w:t>:</w:t>
+        <w:t xml:space="preserve"> line (line 17):</w:t>
       </w:r>
     </w:p>
     <w:p>
@@ -1085,14 +1047,7 @@
               <w:rFonts w:ascii="Cambria Math" w:hAnsi="Cambria Math" w:cs="Times New Roman"/>
               <w:lang w:val="en-US" w:eastAsia="nb-NO"/>
             </w:rPr>
-            <m:t>Socket server = serverSocket.accept()</m:t>
-          </m:r>
-          <m:r>
-            <w:rPr>
-              <w:rFonts w:ascii="Cambria Math" w:hAnsi="Cambria Math" w:cs="Times New Roman"/>
-              <w:lang w:val="en-US" w:eastAsia="nb-NO"/>
-            </w:rPr>
-            <m:t>;</m:t>
+            <m:t>Socket server = serverSocket.accept();</m:t>
           </m:r>
         </m:oMath>
       </m:oMathPara>
@@ -1106,47 +1061,19 @@
         </w:numPr>
         <w:rPr>
           <w:rFonts w:ascii="Times New Roman" w:hAnsi="Times New Roman" w:cs="Times New Roman"/>
-          <w:lang w:val="en-US" w:eastAsia="nb-NO"/>
-        </w:rPr>
-      </w:pPr>
-      <w:r>
-        <w:rPr>
-          <w:rFonts w:ascii="Times New Roman" w:hAnsi="Times New Roman" w:cs="Times New Roman"/>
-          <w:lang w:val="en-US" w:eastAsia="nb-NO"/>
-        </w:rPr>
-        <w:t xml:space="preserve">Subtask 7: Which </w:t>
-      </w:r>
-      <w:proofErr w:type="gramStart"/>
-      <w:r>
-        <w:rPr>
-          <w:rFonts w:ascii="Times New Roman" w:hAnsi="Times New Roman" w:cs="Times New Roman"/>
-          <w:lang w:val="en-US" w:eastAsia="nb-NO"/>
-        </w:rPr>
-        <w:t>lines</w:t>
-      </w:r>
-      <w:proofErr w:type="gramEnd"/>
-      <w:r>
-        <w:rPr>
-          <w:rFonts w:ascii="Times New Roman" w:hAnsi="Times New Roman" w:cs="Times New Roman"/>
-          <w:lang w:val="en-US" w:eastAsia="nb-NO"/>
-        </w:rPr>
-        <w:t xml:space="preserve"> the Server </w:t>
-      </w:r>
-      <w:proofErr w:type="gramStart"/>
-      <w:r>
-        <w:rPr>
-          <w:rFonts w:ascii="Times New Roman" w:hAnsi="Times New Roman" w:cs="Times New Roman"/>
-          <w:lang w:val="en-US" w:eastAsia="nb-NO"/>
-        </w:rPr>
-        <w:t>creates</w:t>
-      </w:r>
-      <w:proofErr w:type="gramEnd"/>
-      <w:r>
-        <w:rPr>
-          <w:rFonts w:ascii="Times New Roman" w:hAnsi="Times New Roman" w:cs="Times New Roman"/>
-          <w:lang w:val="en-US" w:eastAsia="nb-NO"/>
-        </w:rPr>
-        <w:t xml:space="preserve"> I/O Streams for communication with the Client?</w:t>
+          <w:b/>
+          <w:bCs/>
+          <w:lang w:val="en-US" w:eastAsia="nb-NO"/>
+        </w:rPr>
+      </w:pPr>
+      <w:r>
+        <w:rPr>
+          <w:rFonts w:ascii="Times New Roman" w:hAnsi="Times New Roman" w:cs="Times New Roman"/>
+          <w:b/>
+          <w:bCs/>
+          <w:lang w:val="en-US" w:eastAsia="nb-NO"/>
+        </w:rPr>
+        <w:t>Subtask 7: Which lines the Server creates I/O Streams for communication with the Client?</w:t>
       </w:r>
     </w:p>
     <w:p>
@@ -1246,21 +1173,7 @@
           <w:rFonts w:ascii="Times New Roman" w:hAnsi="Times New Roman" w:cs="Times New Roman"/>
           <w:lang w:eastAsia="nb-NO"/>
         </w:rPr>
-        <w:t xml:space="preserve"> lines</w:t>
-      </w:r>
-      <w:r>
-        <w:rPr>
-          <w:rFonts w:ascii="Times New Roman" w:hAnsi="Times New Roman" w:cs="Times New Roman"/>
-          <w:lang w:eastAsia="nb-NO"/>
-        </w:rPr>
-        <w:t xml:space="preserve"> (lines 21 &amp; 24)</w:t>
-      </w:r>
-      <w:r>
-        <w:rPr>
-          <w:rFonts w:ascii="Times New Roman" w:hAnsi="Times New Roman" w:cs="Times New Roman"/>
-          <w:lang w:eastAsia="nb-NO"/>
-        </w:rPr>
-        <w:t>:</w:t>
+        <w:t xml:space="preserve"> lines (lines 21 &amp; 24):</w:t>
       </w:r>
     </w:p>
     <w:p>
@@ -1281,14 +1194,7 @@
               <w:rFonts w:ascii="Cambria Math" w:hAnsi="Cambria Math" w:cs="Times New Roman"/>
               <w:lang w:val="en-US" w:eastAsia="nb-NO"/>
             </w:rPr>
-            <m:t>D</m:t>
-          </m:r>
-          <m:r>
-            <w:rPr>
-              <w:rFonts w:ascii="Cambria Math" w:hAnsi="Cambria Math" w:cs="Times New Roman"/>
-              <w:lang w:val="en-US" w:eastAsia="nb-NO"/>
-            </w:rPr>
-            <m:t xml:space="preserve">ataInputStream in= </m:t>
+            <m:t xml:space="preserve">DataInputStream in= </m:t>
           </m:r>
         </m:oMath>
       </m:oMathPara>
@@ -1311,14 +1217,7 @@
               <w:rFonts w:ascii="Cambria Math" w:hAnsi="Cambria Math" w:cs="Times New Roman"/>
               <w:lang w:val="en-US" w:eastAsia="nb-NO"/>
             </w:rPr>
-            <m:t>new DataInputStream(server.getInputStream())</m:t>
-          </m:r>
-          <m:r>
-            <w:rPr>
-              <w:rFonts w:ascii="Cambria Math" w:hAnsi="Cambria Math" w:cs="Times New Roman"/>
-              <w:lang w:val="en-US" w:eastAsia="nb-NO"/>
-            </w:rPr>
-            <m:t>;</m:t>
+            <m:t>new DataInputStream(server.getInputStream());</m:t>
           </m:r>
         </m:oMath>
       </m:oMathPara>
@@ -1341,14 +1240,7 @@
               <w:rFonts w:ascii="Cambria Math" w:hAnsi="Cambria Math" w:cs="Times New Roman"/>
               <w:lang w:val="en-US" w:eastAsia="nb-NO"/>
             </w:rPr>
-            <m:t>DataOutputStream out =</m:t>
-          </m:r>
-          <m:r>
-            <w:rPr>
-              <w:rFonts w:ascii="Cambria Math" w:hAnsi="Cambria Math" w:cs="Times New Roman"/>
-              <w:lang w:val="en-US" w:eastAsia="nb-NO"/>
-            </w:rPr>
-            <m:t xml:space="preserve"> </m:t>
+            <m:t xml:space="preserve">DataOutputStream out = </m:t>
           </m:r>
         </m:oMath>
       </m:oMathPara>
@@ -1371,14 +1263,7 @@
               <w:rFonts w:ascii="Cambria Math" w:hAnsi="Cambria Math" w:cs="Times New Roman"/>
               <w:lang w:val="en-US" w:eastAsia="nb-NO"/>
             </w:rPr>
-            <m:t>new DataOutputStream(server.getOutputStream())</m:t>
-          </m:r>
-          <m:r>
-            <w:rPr>
-              <w:rFonts w:ascii="Cambria Math" w:hAnsi="Cambria Math" w:cs="Times New Roman"/>
-              <w:lang w:val="en-US" w:eastAsia="nb-NO"/>
-            </w:rPr>
-            <m:t>;</m:t>
+            <m:t>new DataOutputStream(server.getOutputStream());</m:t>
           </m:r>
         </m:oMath>
       </m:oMathPara>
@@ -1392,47 +1277,19 @@
         </w:numPr>
         <w:rPr>
           <w:rFonts w:ascii="Times New Roman" w:hAnsi="Times New Roman" w:cs="Times New Roman"/>
-          <w:lang w:val="en-US" w:eastAsia="nb-NO"/>
-        </w:rPr>
-      </w:pPr>
-      <w:r>
-        <w:rPr>
-          <w:rFonts w:ascii="Times New Roman" w:hAnsi="Times New Roman" w:cs="Times New Roman"/>
-          <w:lang w:val="en-US" w:eastAsia="nb-NO"/>
-        </w:rPr>
-        <w:t xml:space="preserve">Subtask 8: Which </w:t>
-      </w:r>
-      <w:proofErr w:type="gramStart"/>
-      <w:r>
-        <w:rPr>
-          <w:rFonts w:ascii="Times New Roman" w:hAnsi="Times New Roman" w:cs="Times New Roman"/>
-          <w:lang w:val="en-US" w:eastAsia="nb-NO"/>
-        </w:rPr>
-        <w:t>lines</w:t>
-      </w:r>
-      <w:proofErr w:type="gramEnd"/>
-      <w:r>
-        <w:rPr>
-          <w:rFonts w:ascii="Times New Roman" w:hAnsi="Times New Roman" w:cs="Times New Roman"/>
-          <w:lang w:val="en-US" w:eastAsia="nb-NO"/>
-        </w:rPr>
-        <w:t xml:space="preserve"> the Server </w:t>
-      </w:r>
-      <w:proofErr w:type="gramStart"/>
-      <w:r>
-        <w:rPr>
-          <w:rFonts w:ascii="Times New Roman" w:hAnsi="Times New Roman" w:cs="Times New Roman"/>
-          <w:lang w:val="en-US" w:eastAsia="nb-NO"/>
-        </w:rPr>
-        <w:t>performs</w:t>
-      </w:r>
-      <w:proofErr w:type="gramEnd"/>
-      <w:r>
-        <w:rPr>
-          <w:rFonts w:ascii="Times New Roman" w:hAnsi="Times New Roman" w:cs="Times New Roman"/>
-          <w:lang w:val="en-US" w:eastAsia="nb-NO"/>
-        </w:rPr>
-        <w:t xml:space="preserve"> communication with the Client?</w:t>
+          <w:b/>
+          <w:bCs/>
+          <w:lang w:val="en-US" w:eastAsia="nb-NO"/>
+        </w:rPr>
+      </w:pPr>
+      <w:r>
+        <w:rPr>
+          <w:rFonts w:ascii="Times New Roman" w:hAnsi="Times New Roman" w:cs="Times New Roman"/>
+          <w:b/>
+          <w:bCs/>
+          <w:lang w:val="en-US" w:eastAsia="nb-NO"/>
+        </w:rPr>
+        <w:t>Subtask 8: Which lines the Server performs communication with the Client?</w:t>
       </w:r>
     </w:p>
     <w:p>
@@ -1532,14 +1389,7 @@
           <w:rFonts w:ascii="Times New Roman" w:hAnsi="Times New Roman" w:cs="Times New Roman"/>
           <w:lang w:eastAsia="nb-NO"/>
         </w:rPr>
-        <w:t xml:space="preserve"> lines</w:t>
-      </w:r>
-      <w:r>
-        <w:rPr>
-          <w:rFonts w:ascii="Times New Roman" w:hAnsi="Times New Roman" w:cs="Times New Roman"/>
-          <w:lang w:eastAsia="nb-NO"/>
-        </w:rPr>
-        <w:t xml:space="preserve"> (lines 2</w:t>
+        <w:t xml:space="preserve"> lines (lines 2</w:t>
       </w:r>
       <w:r>
         <w:rPr>
@@ -1576,14 +1426,7 @@
               <w:lang w:val="en-US" w:eastAsia="nb-NO"/>
             </w:rPr>
             <w:lastRenderedPageBreak/>
-            <m:t>System.out.println(in.readUTF())</m:t>
-          </m:r>
-          <m:r>
-            <w:rPr>
-              <w:rFonts w:ascii="Cambria Math" w:hAnsi="Cambria Math" w:cs="Times New Roman"/>
-              <w:lang w:val="en-US" w:eastAsia="nb-NO"/>
-            </w:rPr>
-            <m:t>;</m:t>
+            <m:t>System.out.println(in.readUTF());</m:t>
           </m:r>
         </m:oMath>
       </m:oMathPara>
@@ -1629,14 +1472,7 @@
               <w:rFonts w:ascii="Cambria Math" w:hAnsi="Cambria Math" w:cs="Times New Roman"/>
               <w:lang w:val="en-US" w:eastAsia="nb-NO"/>
             </w:rPr>
-            <m:t>server.getLocalSocketAddress()+ "\nGoodbye!")</m:t>
-          </m:r>
-          <m:r>
-            <w:rPr>
-              <w:rFonts w:ascii="Cambria Math" w:hAnsi="Cambria Math" w:cs="Times New Roman"/>
-              <w:lang w:val="en-US" w:eastAsia="nb-NO"/>
-            </w:rPr>
-            <m:t>;</m:t>
+            <m:t>server.getLocalSocketAddress()+ "\nGoodbye!");</m:t>
           </m:r>
         </m:oMath>
       </m:oMathPara>
@@ -1672,25 +1508,11 @@
       <w:r>
         <w:rPr>
           <w:rFonts w:ascii="Times New Roman" w:hAnsi="Times New Roman" w:cs="Times New Roman"/>
-          <w:lang w:val="en-US" w:eastAsia="nb-NO"/>
-        </w:rPr>
-        <w:t xml:space="preserve">Subtask 9: Which </w:t>
-      </w:r>
-      <w:proofErr w:type="gramStart"/>
-      <w:r>
-        <w:rPr>
-          <w:rFonts w:ascii="Times New Roman" w:hAnsi="Times New Roman" w:cs="Times New Roman"/>
-          <w:lang w:val="en-US" w:eastAsia="nb-NO"/>
-        </w:rPr>
-        <w:t>line the connection</w:t>
-      </w:r>
-      <w:proofErr w:type="gramEnd"/>
-      <w:r>
-        <w:rPr>
-          <w:rFonts w:ascii="Times New Roman" w:hAnsi="Times New Roman" w:cs="Times New Roman"/>
-          <w:lang w:val="en-US" w:eastAsia="nb-NO"/>
-        </w:rPr>
-        <w:t xml:space="preserve"> is closed?</w:t>
+          <w:b/>
+          <w:bCs/>
+          <w:lang w:val="en-US" w:eastAsia="nb-NO"/>
+        </w:rPr>
+        <w:t>Subtask 9: Which line the connection is closed?</w:t>
       </w:r>
     </w:p>
     <w:p>
@@ -1752,17 +1574,7 @@
           <w:lang w:eastAsia="nb-NO"/>
           <w14:ligatures w14:val="none"/>
         </w:rPr>
-        <w:t>();</w:t>
-      </w:r>
-      <w:r>
-        <w:rPr>
-          <w:rFonts w:ascii="Times New Roman" w:eastAsiaTheme="majorEastAsia" w:hAnsi="Times New Roman" w:cs="Times New Roman"/>
-          <w:i/>
-          <w:kern w:val="0"/>
-          <w:lang w:eastAsia="nb-NO"/>
-          <w14:ligatures w14:val="none"/>
-        </w:rPr>
-        <w:t xml:space="preserve"> </w:t>
+        <w:t xml:space="preserve">(); </w:t>
       </w:r>
       <w:r>
         <w:rPr>
@@ -1805,12 +1617,16 @@
         </w:numPr>
         <w:rPr>
           <w:rFonts w:ascii="Times New Roman" w:hAnsi="Times New Roman" w:cs="Times New Roman"/>
-          <w:lang w:val="en-US" w:eastAsia="nb-NO"/>
-        </w:rPr>
-      </w:pPr>
-      <w:r>
-        <w:rPr>
-          <w:rFonts w:ascii="Times New Roman" w:hAnsi="Times New Roman" w:cs="Times New Roman"/>
+          <w:b/>
+          <w:bCs/>
+          <w:lang w:val="en-US" w:eastAsia="nb-NO"/>
+        </w:rPr>
+      </w:pPr>
+      <w:r>
+        <w:rPr>
+          <w:rFonts w:ascii="Times New Roman" w:hAnsi="Times New Roman" w:cs="Times New Roman"/>
+          <w:b/>
+          <w:bCs/>
           <w:lang w:val="en-US" w:eastAsia="nb-NO"/>
         </w:rPr>
         <w:t>Subtask 10: Which line the Client creates a socket object?</w:t>
@@ -1854,14 +1670,7 @@
               <w:rFonts w:ascii="Cambria Math" w:hAnsi="Cambria Math" w:cs="Times New Roman"/>
               <w:lang w:val="en-US" w:eastAsia="nb-NO"/>
             </w:rPr>
-            <m:t>Socket client = new Socket(serverName, port)</m:t>
-          </m:r>
-          <m:r>
-            <w:rPr>
-              <w:rFonts w:ascii="Cambria Math" w:hAnsi="Cambria Math" w:cs="Times New Roman"/>
-              <w:lang w:val="en-US" w:eastAsia="nb-NO"/>
-            </w:rPr>
-            <m:t>;</m:t>
+            <m:t>Socket client = new Socket(serverName, port);</m:t>
           </m:r>
         </m:oMath>
       </m:oMathPara>
@@ -1875,47 +1684,48 @@
         </w:numPr>
         <w:rPr>
           <w:rFonts w:ascii="Times New Roman" w:hAnsi="Times New Roman" w:cs="Times New Roman"/>
-          <w:lang w:val="en-US" w:eastAsia="nb-NO"/>
-        </w:rPr>
-      </w:pPr>
-      <w:r>
-        <w:rPr>
-          <w:rFonts w:ascii="Times New Roman" w:hAnsi="Times New Roman" w:cs="Times New Roman"/>
-          <w:lang w:val="en-US" w:eastAsia="nb-NO"/>
-        </w:rPr>
-        <w:t xml:space="preserve">Subtask 11: Which </w:t>
-      </w:r>
-      <w:proofErr w:type="gramStart"/>
-      <w:r>
-        <w:rPr>
-          <w:rFonts w:ascii="Times New Roman" w:hAnsi="Times New Roman" w:cs="Times New Roman"/>
-          <w:lang w:val="en-US" w:eastAsia="nb-NO"/>
-        </w:rPr>
-        <w:t>lines</w:t>
-      </w:r>
-      <w:proofErr w:type="gramEnd"/>
-      <w:r>
-        <w:rPr>
-          <w:rFonts w:ascii="Times New Roman" w:hAnsi="Times New Roman" w:cs="Times New Roman"/>
-          <w:lang w:val="en-US" w:eastAsia="nb-NO"/>
-        </w:rPr>
-        <w:t xml:space="preserve"> the Client </w:t>
-      </w:r>
-      <w:proofErr w:type="gramStart"/>
-      <w:r>
-        <w:rPr>
-          <w:rFonts w:ascii="Times New Roman" w:hAnsi="Times New Roman" w:cs="Times New Roman"/>
-          <w:lang w:val="en-US" w:eastAsia="nb-NO"/>
-        </w:rPr>
-        <w:t>creates</w:t>
-      </w:r>
-      <w:proofErr w:type="gramEnd"/>
-      <w:r>
-        <w:rPr>
-          <w:rFonts w:ascii="Times New Roman" w:hAnsi="Times New Roman" w:cs="Times New Roman"/>
-          <w:lang w:val="en-US" w:eastAsia="nb-NO"/>
-        </w:rPr>
-        <w:t xml:space="preserve"> I/O Streams for communication with the Silent?</w:t>
+          <w:b/>
+          <w:bCs/>
+          <w:lang w:val="en-US" w:eastAsia="nb-NO"/>
+        </w:rPr>
+      </w:pPr>
+      <w:r>
+        <w:rPr>
+          <w:rFonts w:ascii="Times New Roman" w:hAnsi="Times New Roman" w:cs="Times New Roman"/>
+          <w:b/>
+          <w:bCs/>
+          <w:lang w:val="en-US" w:eastAsia="nb-NO"/>
+        </w:rPr>
+        <w:t xml:space="preserve">Subtask 11: Which lines the Client creates I/O Streams for communication with the </w:t>
+      </w:r>
+      <w:proofErr w:type="spellStart"/>
+      <w:r>
+        <w:rPr>
+          <w:rFonts w:ascii="Times New Roman" w:hAnsi="Times New Roman" w:cs="Times New Roman"/>
+          <w:b/>
+          <w:bCs/>
+          <w:lang w:val="en-US" w:eastAsia="nb-NO"/>
+        </w:rPr>
+        <w:t>C</w:t>
+      </w:r>
+      <w:r>
+        <w:rPr>
+          <w:rFonts w:ascii="Times New Roman" w:hAnsi="Times New Roman" w:cs="Times New Roman"/>
+          <w:b/>
+          <w:bCs/>
+          <w:lang w:val="en-US" w:eastAsia="nb-NO"/>
+        </w:rPr>
+        <w:t>ilent</w:t>
+      </w:r>
+      <w:proofErr w:type="spellEnd"/>
+      <w:r>
+        <w:rPr>
+          <w:rFonts w:ascii="Times New Roman" w:hAnsi="Times New Roman" w:cs="Times New Roman"/>
+          <w:b/>
+          <w:bCs/>
+          <w:lang w:val="en-US" w:eastAsia="nb-NO"/>
+        </w:rPr>
+        <w:t>?</w:t>
       </w:r>
     </w:p>
     <w:p>
@@ -1975,14 +1785,7 @@
               <w:rFonts w:ascii="Cambria Math" w:hAnsi="Cambria Math" w:cs="Times New Roman"/>
               <w:lang w:eastAsia="nb-NO"/>
             </w:rPr>
-            <m:t>;</m:t>
-          </m:r>
-          <m:r>
-            <w:rPr>
-              <w:rFonts w:ascii="Cambria Math" w:hAnsi="Cambria Math" w:cs="Times New Roman"/>
-              <w:lang w:eastAsia="nb-NO"/>
-            </w:rPr>
-            <m:t xml:space="preserve"> </m:t>
+            <m:t xml:space="preserve">; </m:t>
           </m:r>
         </m:oMath>
       </m:oMathPara>
@@ -2005,14 +1808,7 @@
               <w:rFonts w:ascii="Cambria Math" w:hAnsi="Cambria Math" w:cs="Times New Roman"/>
               <w:lang w:eastAsia="nb-NO"/>
             </w:rPr>
-            <m:t>DataOutputStream out = new DataOutputStream(outToServer)</m:t>
-          </m:r>
-          <m:r>
-            <w:rPr>
-              <w:rFonts w:ascii="Cambria Math" w:hAnsi="Cambria Math" w:cs="Times New Roman"/>
-              <w:lang w:eastAsia="nb-NO"/>
-            </w:rPr>
-            <m:t>;</m:t>
+            <m:t>DataOutputStream out = new DataOutputStream(outToServer);</m:t>
           </m:r>
         </m:oMath>
       </m:oMathPara>
@@ -2064,14 +1860,7 @@
               <w:rFonts w:ascii="Cambria Math" w:hAnsi="Cambria Math" w:cs="Times New Roman"/>
               <w:lang w:val="en-US" w:eastAsia="nb-NO"/>
             </w:rPr>
-            <m:t>DataInputStream in = new DataInputStream(inFromServer)</m:t>
-          </m:r>
-          <m:r>
-            <w:rPr>
-              <w:rFonts w:ascii="Cambria Math" w:hAnsi="Cambria Math" w:cs="Times New Roman"/>
-              <w:lang w:val="en-US" w:eastAsia="nb-NO"/>
-            </w:rPr>
-            <m:t>;</m:t>
+            <m:t>DataInputStream in = new DataInputStream(inFromServer);</m:t>
           </m:r>
         </m:oMath>
       </m:oMathPara>
@@ -2085,47 +1874,19 @@
         </w:numPr>
         <w:rPr>
           <w:rFonts w:ascii="Times New Roman" w:hAnsi="Times New Roman" w:cs="Times New Roman"/>
-          <w:lang w:val="en-US" w:eastAsia="nb-NO"/>
-        </w:rPr>
-      </w:pPr>
-      <w:r>
-        <w:rPr>
-          <w:rFonts w:ascii="Times New Roman" w:hAnsi="Times New Roman" w:cs="Times New Roman"/>
-          <w:lang w:val="en-US" w:eastAsia="nb-NO"/>
-        </w:rPr>
-        <w:t xml:space="preserve">Subtask 12: Which </w:t>
-      </w:r>
-      <w:proofErr w:type="gramStart"/>
-      <w:r>
-        <w:rPr>
-          <w:rFonts w:ascii="Times New Roman" w:hAnsi="Times New Roman" w:cs="Times New Roman"/>
-          <w:lang w:val="en-US" w:eastAsia="nb-NO"/>
-        </w:rPr>
-        <w:t>lines</w:t>
-      </w:r>
-      <w:proofErr w:type="gramEnd"/>
-      <w:r>
-        <w:rPr>
-          <w:rFonts w:ascii="Times New Roman" w:hAnsi="Times New Roman" w:cs="Times New Roman"/>
-          <w:lang w:val="en-US" w:eastAsia="nb-NO"/>
-        </w:rPr>
-        <w:t xml:space="preserve"> the Client </w:t>
-      </w:r>
-      <w:proofErr w:type="gramStart"/>
-      <w:r>
-        <w:rPr>
-          <w:rFonts w:ascii="Times New Roman" w:hAnsi="Times New Roman" w:cs="Times New Roman"/>
-          <w:lang w:val="en-US" w:eastAsia="nb-NO"/>
-        </w:rPr>
-        <w:t>performs</w:t>
-      </w:r>
-      <w:proofErr w:type="gramEnd"/>
-      <w:r>
-        <w:rPr>
-          <w:rFonts w:ascii="Times New Roman" w:hAnsi="Times New Roman" w:cs="Times New Roman"/>
-          <w:lang w:val="en-US" w:eastAsia="nb-NO"/>
-        </w:rPr>
-        <w:t xml:space="preserve"> communication with the Client?</w:t>
+          <w:b/>
+          <w:bCs/>
+          <w:lang w:val="en-US" w:eastAsia="nb-NO"/>
+        </w:rPr>
+      </w:pPr>
+      <w:r>
+        <w:rPr>
+          <w:rFonts w:ascii="Times New Roman" w:hAnsi="Times New Roman" w:cs="Times New Roman"/>
+          <w:b/>
+          <w:bCs/>
+          <w:lang w:val="en-US" w:eastAsia="nb-NO"/>
+        </w:rPr>
+        <w:t>Subtask 12: Which lines the Client performs communication with the Client?</w:t>
       </w:r>
     </w:p>
     <w:p>
@@ -2195,47 +1956,19 @@
         </w:numPr>
         <w:rPr>
           <w:rFonts w:ascii="Times New Roman" w:hAnsi="Times New Roman" w:cs="Times New Roman"/>
-          <w:lang w:val="en-US" w:eastAsia="nb-NO"/>
-        </w:rPr>
-      </w:pPr>
-      <w:r>
-        <w:rPr>
-          <w:rFonts w:ascii="Times New Roman" w:hAnsi="Times New Roman" w:cs="Times New Roman"/>
-          <w:lang w:val="en-US" w:eastAsia="nb-NO"/>
-        </w:rPr>
-        <w:t xml:space="preserve">Subtask 13: Which </w:t>
-      </w:r>
-      <w:proofErr w:type="gramStart"/>
-      <w:r>
-        <w:rPr>
-          <w:rFonts w:ascii="Times New Roman" w:hAnsi="Times New Roman" w:cs="Times New Roman"/>
-          <w:lang w:val="en-US" w:eastAsia="nb-NO"/>
-        </w:rPr>
-        <w:t>line the connection</w:t>
-      </w:r>
-      <w:proofErr w:type="gramEnd"/>
-      <w:r>
-        <w:rPr>
-          <w:rFonts w:ascii="Times New Roman" w:hAnsi="Times New Roman" w:cs="Times New Roman"/>
-          <w:lang w:val="en-US" w:eastAsia="nb-NO"/>
-        </w:rPr>
-        <w:t xml:space="preserve"> is </w:t>
-      </w:r>
-      <w:proofErr w:type="gramStart"/>
-      <w:r>
-        <w:rPr>
-          <w:rFonts w:ascii="Times New Roman" w:hAnsi="Times New Roman" w:cs="Times New Roman"/>
-          <w:lang w:val="en-US" w:eastAsia="nb-NO"/>
-        </w:rPr>
-        <w:t>closed</w:t>
-      </w:r>
-      <w:proofErr w:type="gramEnd"/>
-      <w:r>
-        <w:rPr>
-          <w:rFonts w:ascii="Times New Roman" w:hAnsi="Times New Roman" w:cs="Times New Roman"/>
-          <w:lang w:val="en-US" w:eastAsia="nb-NO"/>
-        </w:rPr>
-        <w:t>?</w:t>
+          <w:b/>
+          <w:bCs/>
+          <w:lang w:val="en-US" w:eastAsia="nb-NO"/>
+        </w:rPr>
+      </w:pPr>
+      <w:r>
+        <w:rPr>
+          <w:rFonts w:ascii="Times New Roman" w:hAnsi="Times New Roman" w:cs="Times New Roman"/>
+          <w:b/>
+          <w:bCs/>
+          <w:lang w:val="en-US" w:eastAsia="nb-NO"/>
+        </w:rPr>
+        <w:t>Subtask 13: Which line the connection is closed?</w:t>
       </w:r>
     </w:p>
     <w:p>
@@ -2276,14 +2009,7 @@
               <w:rFonts w:ascii="Cambria Math" w:hAnsi="Cambria Math" w:cs="Times New Roman"/>
               <w:lang w:val="en-US" w:eastAsia="nb-NO"/>
             </w:rPr>
-            <m:t>client.close()</m:t>
-          </m:r>
-          <m:r>
-            <w:rPr>
-              <w:rFonts w:ascii="Cambria Math" w:hAnsi="Cambria Math" w:cs="Times New Roman"/>
-              <w:lang w:val="en-US" w:eastAsia="nb-NO"/>
-            </w:rPr>
-            <m:t>;</m:t>
+            <m:t>client.close();</m:t>
           </m:r>
         </m:oMath>
       </m:oMathPara>
@@ -2330,25 +2056,66 @@
       <w:r>
         <w:rPr>
           <w:rFonts w:ascii="Times New Roman" w:hAnsi="Times New Roman" w:cs="Times New Roman"/>
-          <w:lang w:val="en-US" w:eastAsia="nb-NO"/>
-        </w:rPr>
-        <w:t xml:space="preserve">Subtask 14: How do you relate the above operations of Client and Server to the </w:t>
-      </w:r>
-      <w:r>
-        <w:rPr>
-          <w:rFonts w:ascii="Times New Roman" w:hAnsi="Times New Roman" w:cs="Times New Roman"/>
           <w:b/>
           <w:bCs/>
           <w:lang w:val="en-US" w:eastAsia="nb-NO"/>
         </w:rPr>
+        <w:t xml:space="preserve">Subtask 14: How do you relate the above operations of Client and Server to the </w:t>
+      </w:r>
+      <w:r>
+        <w:rPr>
+          <w:rFonts w:ascii="Times New Roman" w:hAnsi="Times New Roman" w:cs="Times New Roman"/>
+          <w:b/>
+          <w:bCs/>
+          <w:u w:val="single"/>
+          <w:lang w:val="en-US" w:eastAsia="nb-NO"/>
+        </w:rPr>
         <w:t>Three-way handshake</w:t>
       </w:r>
       <w:r>
         <w:rPr>
           <w:rFonts w:ascii="Times New Roman" w:hAnsi="Times New Roman" w:cs="Times New Roman"/>
-          <w:lang w:val="en-US" w:eastAsia="nb-NO"/>
-        </w:rPr>
-        <w:t xml:space="preserve"> data transmission in TCP protocol?  </w:t>
+          <w:b/>
+          <w:bCs/>
+          <w:lang w:val="en-US" w:eastAsia="nb-NO"/>
+        </w:rPr>
+        <w:t xml:space="preserve"> data transmission in TCP protocol? </w:t>
+      </w:r>
+    </w:p>
+    <w:p>
+      <w:pPr>
+        <w:pStyle w:val="Listeavsnitt"/>
+        <w:numPr>
+          <w:ilvl w:val="1"/>
+          <w:numId w:val="24"/>
+        </w:numPr>
+        <w:rPr>
+          <w:rFonts w:ascii="Times New Roman" w:eastAsiaTheme="majorEastAsia" w:hAnsi="Times New Roman" w:cs="Times New Roman"/>
+          <w:color w:val="EE0000"/>
+          <w:kern w:val="0"/>
+          <w:lang w:val="en-US" w:eastAsia="nb-NO"/>
+          <w14:ligatures w14:val="none"/>
+        </w:rPr>
+      </w:pPr>
+      <w:r>
+        <w:rPr>
+          <w:rFonts w:ascii="Times New Roman" w:eastAsiaTheme="majorEastAsia" w:hAnsi="Times New Roman" w:cs="Times New Roman"/>
+          <w:color w:val="EE0000"/>
+          <w:kern w:val="0"/>
+          <w:lang w:val="en-US" w:eastAsia="nb-NO"/>
+          <w14:ligatures w14:val="none"/>
+        </w:rPr>
+        <w:t>Not answered</w:t>
+      </w:r>
+      <w:r>
+        <w:rPr>
+          <w:rFonts w:ascii="Times New Roman" w:eastAsiaTheme="majorEastAsia" w:hAnsi="Times New Roman" w:cs="Times New Roman"/>
+          <w:color w:val="EE0000"/>
+          <w:kern w:val="0"/>
+          <w:lang w:val="en-US" w:eastAsia="nb-NO"/>
+          <w14:ligatures w14:val="none"/>
+        </w:rPr>
+        <w:t xml:space="preserve"> yet</w:t>
       </w:r>
     </w:p>
     <w:p>
@@ -2389,6 +2156,7 @@
           <w:lang w:val="en-US" w:eastAsia="nb-NO"/>
           <w14:ligatures w14:val="none"/>
         </w:rPr>
+        <w:lastRenderedPageBreak/>
         <w:t xml:space="preserve">Exercise </w:t>
       </w:r>
       <w:r>
@@ -2448,7 +2216,6 @@
           <w:u w:val="single"/>
           <w:lang w:val="en-US" w:eastAsia="nb-NO"/>
         </w:rPr>
-        <w:lastRenderedPageBreak/>
         <w:t>Subtask 1:</w:t>
       </w:r>
       <w:r>
@@ -2457,6 +2224,55 @@
           <w:lang w:val="en-US" w:eastAsia="nb-NO"/>
         </w:rPr>
         <w:t xml:space="preserve"> Run the code and include output:</w:t>
+      </w:r>
+    </w:p>
+    <w:p>
+      <w:pPr>
+        <w:rPr>
+          <w:rFonts w:ascii="Times New Roman" w:hAnsi="Times New Roman" w:cs="Times New Roman"/>
+          <w:lang w:val="en-US" w:eastAsia="nb-NO"/>
+        </w:rPr>
+      </w:pPr>
+      <w:r>
+        <w:rPr>
+          <w:rFonts w:ascii="Times New Roman" w:hAnsi="Times New Roman" w:cs="Times New Roman"/>
+          <w:lang w:val="en-US" w:eastAsia="nb-NO"/>
+        </w:rPr>
+        <w:drawing>
+          <wp:inline distT="0" distB="0" distL="0" distR="0" wp14:anchorId="78193183" wp14:editId="4E4850EB">
+            <wp:extent cx="5760720" cy="705485"/>
+            <wp:effectExtent l="0" t="0" r="5080" b="5715"/>
+            <wp:docPr id="1109155727" name="Bilde 1"/>
+            <wp:cNvGraphicFramePr>
+              <a:graphicFrameLocks xmlns:a="http://schemas.openxmlformats.org/drawingml/2006/main" noChangeAspect="1"/>
+            </wp:cNvGraphicFramePr>
+            <a:graphic xmlns:a="http://schemas.openxmlformats.org/drawingml/2006/main">
+              <a:graphicData uri="http://schemas.openxmlformats.org/drawingml/2006/picture">
+                <pic:pic xmlns:pic="http://schemas.openxmlformats.org/drawingml/2006/picture">
+                  <pic:nvPicPr>
+                    <pic:cNvPr id="1109155727" name=""/>
+                    <pic:cNvPicPr/>
+                  </pic:nvPicPr>
+                  <pic:blipFill>
+                    <a:blip r:embed="rId8"/>
+                    <a:stretch>
+                      <a:fillRect/>
+                    </a:stretch>
+                  </pic:blipFill>
+                  <pic:spPr>
+                    <a:xfrm>
+                      <a:off x="0" y="0"/>
+                      <a:ext cx="5760720" cy="705485"/>
+                    </a:xfrm>
+                    <a:prstGeom prst="rect">
+                      <a:avLst/>
+                    </a:prstGeom>
+                  </pic:spPr>
+                </pic:pic>
+              </a:graphicData>
+            </a:graphic>
+          </wp:inline>
+        </w:drawing>
       </w:r>
     </w:p>
     <w:p>
@@ -2482,6 +2298,48 @@
           <w:lang w:val="en-US" w:eastAsia="nb-NO"/>
         </w:rPr>
         <w:t xml:space="preserve"> Which class should run first?</w:t>
+      </w:r>
+    </w:p>
+    <w:p>
+      <w:pPr>
+        <w:pStyle w:val="Listeavsnitt"/>
+        <w:numPr>
+          <w:ilvl w:val="0"/>
+          <w:numId w:val="24"/>
+        </w:numPr>
+        <w:rPr>
+          <w:rFonts w:ascii="Times New Roman" w:hAnsi="Times New Roman" w:cs="Times New Roman"/>
+          <w:lang w:val="en-US" w:eastAsia="nb-NO"/>
+        </w:rPr>
+      </w:pPr>
+      <w:r>
+        <w:rPr>
+          <w:rFonts w:ascii="Times New Roman" w:hAnsi="Times New Roman" w:cs="Times New Roman"/>
+          <w:lang w:val="en-US" w:eastAsia="nb-NO"/>
+        </w:rPr>
+        <w:t xml:space="preserve">This is the same situation as in Exercise 1. </w:t>
+      </w:r>
+      <w:r>
+        <w:rPr>
+          <w:rFonts w:ascii="Times New Roman" w:hAnsi="Times New Roman" w:cs="Times New Roman"/>
+          <w:lang w:val="en-US" w:eastAsia="nb-NO"/>
+        </w:rPr>
+        <w:t xml:space="preserve">The Server should always run first. The reason for this is because of </w:t>
+      </w:r>
+      <w:r>
+        <w:rPr>
+          <w:rFonts w:ascii="Times New Roman" w:hAnsi="Times New Roman" w:cs="Times New Roman"/>
+          <w:u w:val="single"/>
+          <w:lang w:val="en-US" w:eastAsia="nb-NO"/>
+        </w:rPr>
+        <w:t>Socket</w:t>
+      </w:r>
+      <w:r>
+        <w:rPr>
+          <w:rFonts w:ascii="Times New Roman" w:hAnsi="Times New Roman" w:cs="Times New Roman"/>
+          <w:lang w:val="en-US" w:eastAsia="nb-NO"/>
+        </w:rPr>
+        <w:t>. Client immediately tries to establish a connection when it runs. This means, if the Server is not running, the connection will fail.</w:t>
       </w:r>
     </w:p>
     <w:p>
@@ -2630,17 +2488,8 @@
           <w:rFonts w:ascii="Times New Roman" w:hAnsi="Times New Roman" w:cs="Times New Roman"/>
           <w:lang w:val="en-US" w:eastAsia="nb-NO"/>
         </w:rPr>
-        <w:t xml:space="preserve"> Can we </w:t>
-      </w:r>
-      <w:proofErr w:type="gramStart"/>
-      <w:r>
-        <w:rPr>
-          <w:rFonts w:ascii="Times New Roman" w:hAnsi="Times New Roman" w:cs="Times New Roman"/>
-          <w:lang w:val="en-US" w:eastAsia="nb-NO"/>
-        </w:rPr>
-        <w:t>setup</w:t>
-      </w:r>
-      <w:proofErr w:type="gramEnd"/>
+        <w:t xml:space="preserve"> Can we setup</w:t>
+      </w:r>
       <w:r>
         <w:rPr>
           <w:rFonts w:ascii="Times New Roman" w:hAnsi="Times New Roman" w:cs="Times New Roman"/>
@@ -2650,8 +2499,8 @@
       </w:r>
     </w:p>
     <w:sectPr>
-      <w:headerReference w:type="even" r:id="rId8"/>
-      <w:headerReference w:type="default" r:id="rId9"/>
+      <w:headerReference w:type="even" r:id="rId9"/>
+      <w:headerReference w:type="default" r:id="rId10"/>
       <w:pgSz w:w="11906" w:h="16838"/>
       <w:pgMar w:top="1417" w:right="1417" w:bottom="1417" w:left="1417" w:header="708" w:footer="708" w:gutter="0"/>
       <w:cols w:space="708"/>
@@ -2724,11 +2573,6 @@
         <w:docPartUnique/>
       </w:docPartObj>
     </w:sdtPr>
-    <w:sdtEndPr>
-      <w:rPr>
-        <w:rStyle w:val="Sidetall"/>
-      </w:rPr>
-    </w:sdtEndPr>
     <w:sdtContent>
       <w:p>
         <w:pPr>
@@ -2787,11 +2631,6 @@
         <w:docPartUnique/>
       </w:docPartObj>
     </w:sdtPr>
-    <w:sdtEndPr>
-      <w:rPr>
-        <w:rStyle w:val="Sidetall"/>
-      </w:rPr>
-    </w:sdtEndPr>
     <w:sdtContent>
       <w:p>
         <w:pPr>
@@ -3652,7 +3491,7 @@
         <w:sz w:val="24"/>
       </w:rPr>
     </w:lvl>
-    <w:lvl w:ilvl="1" w:tplc="04140003" w:tentative="1">
+    <w:lvl w:ilvl="1" w:tplc="04140003">
       <w:start w:val="1"/>
       <w:numFmt w:val="bullet"/>
       <w:lvlText w:val="o"/>
@@ -6145,6 +5984,7 @@
   <w:style w:type="character" w:default="1" w:styleId="Standardskriftforavsnitt">
     <w:name w:val="Default Paragraph Font"/>
     <w:uiPriority w:val="1"/>
+    <w:semiHidden/>
     <w:unhideWhenUsed/>
   </w:style>
   <w:style w:type="table" w:default="1" w:styleId="Vanligtabell">

</xml_diff>

<commit_message>
lab11: update lab11 report
</commit_message>
<xml_diff>
--- a/lab11/lab11_report.docx
+++ b/lab11/lab11_report.docx
@@ -842,18 +842,8 @@
           <w:i/>
           <w:lang w:val="en-US" w:eastAsia="nb-NO"/>
         </w:rPr>
-        <w:t>(port</w:t>
-      </w:r>
-      <w:proofErr w:type="gramStart"/>
-      <w:r>
-        <w:rPr>
-          <w:rFonts w:ascii="Times New Roman" w:hAnsi="Times New Roman" w:cs="Times New Roman"/>
-          <w:i/>
-          <w:lang w:val="en-US" w:eastAsia="nb-NO"/>
-        </w:rPr>
-        <w:t>);</w:t>
-      </w:r>
-      <w:proofErr w:type="gramEnd"/>
+        <w:t>(port);</w:t>
+      </w:r>
     </w:p>
     <w:p>
       <w:pPr>
@@ -1488,7 +1478,6 @@
         </w:rPr>
       </w:pPr>
       <w:proofErr w:type="spellStart"/>
-      <w:proofErr w:type="gramStart"/>
       <w:r>
         <w:rPr>
           <w:rFonts w:ascii="Times New Roman" w:eastAsiaTheme="majorEastAsia" w:hAnsi="Times New Roman" w:cs="Times New Roman"/>
@@ -1500,7 +1489,6 @@
         <w:t>server.close</w:t>
       </w:r>
       <w:proofErr w:type="spellEnd"/>
-      <w:proofErr w:type="gramEnd"/>
       <w:r>
         <w:rPr>
           <w:rFonts w:ascii="Times New Roman" w:eastAsiaTheme="majorEastAsia" w:hAnsi="Times New Roman" w:cs="Times New Roman"/>
@@ -2026,7 +2014,6 @@
         </w:numPr>
         <w:rPr>
           <w:rFonts w:ascii="Times New Roman" w:eastAsiaTheme="majorEastAsia" w:hAnsi="Times New Roman" w:cs="Times New Roman"/>
-          <w:color w:val="EE0000"/>
           <w:kern w:val="0"/>
           <w:lang w:val="en-US" w:eastAsia="nb-NO"/>
           <w14:ligatures w14:val="none"/>
@@ -2035,22 +2022,29 @@
       <w:r>
         <w:rPr>
           <w:rFonts w:ascii="Times New Roman" w:eastAsiaTheme="majorEastAsia" w:hAnsi="Times New Roman" w:cs="Times New Roman"/>
-          <w:color w:val="EE0000"/>
           <w:kern w:val="0"/>
           <w:lang w:val="en-US" w:eastAsia="nb-NO"/>
           <w14:ligatures w14:val="none"/>
         </w:rPr>
-        <w:t>Not answered</w:t>
+        <w:t>First the client tries to connect to the server, then the server accepts the</w:t>
       </w:r>
       <w:r>
         <w:rPr>
           <w:rFonts w:ascii="Times New Roman" w:eastAsiaTheme="majorEastAsia" w:hAnsi="Times New Roman" w:cs="Times New Roman"/>
-          <w:color w:val="EE0000"/>
           <w:kern w:val="0"/>
           <w:lang w:val="en-US" w:eastAsia="nb-NO"/>
           <w14:ligatures w14:val="none"/>
         </w:rPr>
         <w:t xml:space="preserve"> </w:t>
+      </w:r>
+      <w:r>
+        <w:rPr>
+          <w:rFonts w:ascii="Times New Roman" w:eastAsiaTheme="majorEastAsia" w:hAnsi="Times New Roman" w:cs="Times New Roman"/>
+          <w:kern w:val="0"/>
+          <w:lang w:val="en-US" w:eastAsia="nb-NO"/>
+          <w14:ligatures w14:val="none"/>
+        </w:rPr>
+        <w:t>connection. Lastly, they exchange data through input and output streams.</w:t>
       </w:r>
     </w:p>
     <w:p>
@@ -2066,9 +2060,7 @@
           <w14:ligatures w14:val="none"/>
         </w:rPr>
       </w:pPr>
-    </w:p>
-    <w:p>
-      <w:pPr>
+      <w:r>
         <w:rPr>
           <w:rFonts w:ascii="Times New Roman" w:eastAsiaTheme="majorEastAsia" w:hAnsi="Times New Roman" w:cs="Times New Roman"/>
           <w:b/>
@@ -2079,7 +2071,8 @@
           <w:lang w:val="en-US" w:eastAsia="nb-NO"/>
           <w14:ligatures w14:val="none"/>
         </w:rPr>
-      </w:pPr>
+        <w:t xml:space="preserve">Exercise </w:t>
+      </w:r>
       <w:r>
         <w:rPr>
           <w:rFonts w:ascii="Times New Roman" w:eastAsiaTheme="majorEastAsia" w:hAnsi="Times New Roman" w:cs="Times New Roman"/>
@@ -2091,8 +2084,7 @@
           <w:lang w:val="en-US" w:eastAsia="nb-NO"/>
           <w14:ligatures w14:val="none"/>
         </w:rPr>
-        <w:lastRenderedPageBreak/>
-        <w:t xml:space="preserve">Exercise </w:t>
+        <w:t>2</w:t>
       </w:r>
       <w:r>
         <w:rPr>
@@ -2105,8 +2097,9 @@
           <w:lang w:val="en-US" w:eastAsia="nb-NO"/>
           <w14:ligatures w14:val="none"/>
         </w:rPr>
-        <w:t>2</w:t>
-      </w:r>
+        <w:t xml:space="preserve">: </w:t>
+      </w:r>
+      <w:proofErr w:type="spellStart"/>
       <w:r>
         <w:rPr>
           <w:rFonts w:ascii="Times New Roman" w:eastAsiaTheme="majorEastAsia" w:hAnsi="Times New Roman" w:cs="Times New Roman"/>
@@ -2118,20 +2111,6 @@
           <w:lang w:val="en-US" w:eastAsia="nb-NO"/>
           <w14:ligatures w14:val="none"/>
         </w:rPr>
-        <w:t xml:space="preserve">: </w:t>
-      </w:r>
-      <w:proofErr w:type="spellStart"/>
-      <w:r>
-        <w:rPr>
-          <w:rFonts w:ascii="Times New Roman" w:eastAsiaTheme="majorEastAsia" w:hAnsi="Times New Roman" w:cs="Times New Roman"/>
-          <w:b/>
-          <w:bCs/>
-          <w:kern w:val="0"/>
-          <w:sz w:val="36"/>
-          <w:szCs w:val="36"/>
-          <w:lang w:val="en-US" w:eastAsia="nb-NO"/>
-          <w14:ligatures w14:val="none"/>
-        </w:rPr>
         <w:t>SocketUDP</w:t>
       </w:r>
       <w:proofErr w:type="spellEnd"/>
@@ -2151,6 +2130,7 @@
           <w:u w:val="single"/>
           <w:lang w:val="en-US" w:eastAsia="nb-NO"/>
         </w:rPr>
+        <w:lastRenderedPageBreak/>
         <w:t>Subtask 1:</w:t>
       </w:r>
       <w:r>
@@ -2293,23 +2273,7 @@
           <w:rFonts w:ascii="Times New Roman" w:hAnsi="Times New Roman" w:cs="Times New Roman"/>
           <w:lang w:val="en-US" w:eastAsia="nb-NO"/>
         </w:rPr>
-        <w:t xml:space="preserve"> Create the output </w:t>
-      </w:r>
-      <w:proofErr w:type="gramStart"/>
-      <w:r>
-        <w:rPr>
-          <w:rFonts w:ascii="Times New Roman" w:hAnsi="Times New Roman" w:cs="Times New Roman"/>
-          <w:lang w:val="en-US" w:eastAsia="nb-NO"/>
-        </w:rPr>
-        <w:t>similar to</w:t>
-      </w:r>
-      <w:proofErr w:type="gramEnd"/>
-      <w:r>
-        <w:rPr>
-          <w:rFonts w:ascii="Times New Roman" w:hAnsi="Times New Roman" w:cs="Times New Roman"/>
-          <w:lang w:val="en-US" w:eastAsia="nb-NO"/>
-        </w:rPr>
-        <w:t xml:space="preserve"> the figure below. How and why can the server receive multiple requests with multiple ports from client(s)?</w:t>
+        <w:t xml:space="preserve"> Create the output similar to the figure below. How and why can the server receive multiple requests with multiple ports from client(s)?</w:t>
       </w:r>
     </w:p>
     <w:p>
@@ -2386,7 +2350,6 @@
         <w:t xml:space="preserve">Change </w:t>
       </w:r>
       <w:proofErr w:type="spellStart"/>
-      <w:proofErr w:type="gramStart"/>
       <w:r>
         <w:rPr>
           <w:rFonts w:ascii="Times New Roman" w:hAnsi="Times New Roman" w:cs="Times New Roman"/>
@@ -2395,7 +2358,6 @@
         <w:t>receivingData</w:t>
       </w:r>
       <w:proofErr w:type="spellEnd"/>
-      <w:proofErr w:type="gramEnd"/>
       <w:r>
         <w:rPr>
           <w:rFonts w:ascii="Times New Roman" w:hAnsi="Times New Roman" w:cs="Times New Roman"/>
@@ -2652,28 +2614,28 @@
           <w:rFonts w:ascii="Times New Roman" w:hAnsi="Times New Roman" w:cs="Times New Roman"/>
           <w:lang w:val="en-US" w:eastAsia="nb-NO"/>
         </w:rPr>
+        <w:t>Figure 6:</w:t>
+      </w:r>
+      <w:r>
+        <w:rPr>
+          <w:rFonts w:ascii="Times New Roman" w:hAnsi="Times New Roman" w:cs="Times New Roman"/>
+          <w:lang w:val="en-US" w:eastAsia="nb-NO"/>
+        </w:rPr>
+        <w:t xml:space="preserve"> Code changes are pushed</w:t>
+      </w:r>
+    </w:p>
+    <w:p>
+      <w:pPr>
+        <w:ind w:left="360" w:firstLine="348"/>
+        <w:rPr>
+          <w:noProof/>
+        </w:rPr>
+      </w:pPr>
+      <w:r>
+        <w:rPr>
+          <w:noProof/>
+        </w:rPr>
         <w:lastRenderedPageBreak/>
-        <w:t>Figure 6:</w:t>
-      </w:r>
-      <w:r>
-        <w:rPr>
-          <w:rFonts w:ascii="Times New Roman" w:hAnsi="Times New Roman" w:cs="Times New Roman"/>
-          <w:lang w:val="en-US" w:eastAsia="nb-NO"/>
-        </w:rPr>
-        <w:t xml:space="preserve"> Code changes are pushed</w:t>
-      </w:r>
-    </w:p>
-    <w:p>
-      <w:pPr>
-        <w:ind w:left="360" w:firstLine="348"/>
-        <w:rPr>
-          <w:noProof/>
-        </w:rPr>
-      </w:pPr>
-      <w:r>
-        <w:rPr>
-          <w:noProof/>
-        </w:rPr>
         <w:t xml:space="preserve"> </w:t>
       </w:r>
       <w:r>
@@ -2906,23 +2868,7 @@
           <w:rFonts w:ascii="Times New Roman" w:hAnsi="Times New Roman" w:cs="Times New Roman"/>
           <w:lang w:val="en-US" w:eastAsia="nb-NO"/>
         </w:rPr>
-        <w:t xml:space="preserve">Senders </w:t>
-      </w:r>
-      <w:proofErr w:type="gramStart"/>
-      <w:r>
-        <w:rPr>
-          <w:rFonts w:ascii="Times New Roman" w:hAnsi="Times New Roman" w:cs="Times New Roman"/>
-          <w:lang w:val="en-US" w:eastAsia="nb-NO"/>
-        </w:rPr>
-        <w:t>send</w:t>
-      </w:r>
-      <w:proofErr w:type="gramEnd"/>
-      <w:r>
-        <w:rPr>
-          <w:rFonts w:ascii="Times New Roman" w:hAnsi="Times New Roman" w:cs="Times New Roman"/>
-          <w:lang w:val="en-US" w:eastAsia="nb-NO"/>
-        </w:rPr>
-        <w:t xml:space="preserve"> to one multicast group</w:t>
+        <w:t>Senders send to one multicast group</w:t>
       </w:r>
     </w:p>
     <w:p>
@@ -2942,23 +2888,7 @@
           <w:rFonts w:ascii="Times New Roman" w:hAnsi="Times New Roman" w:cs="Times New Roman"/>
           <w:lang w:val="en-US" w:eastAsia="nb-NO"/>
         </w:rPr>
-        <w:t xml:space="preserve">Any </w:t>
-      </w:r>
-      <w:proofErr w:type="gramStart"/>
-      <w:r>
-        <w:rPr>
-          <w:rFonts w:ascii="Times New Roman" w:hAnsi="Times New Roman" w:cs="Times New Roman"/>
-          <w:lang w:val="en-US" w:eastAsia="nb-NO"/>
-        </w:rPr>
-        <w:t>receivers</w:t>
-      </w:r>
-      <w:proofErr w:type="gramEnd"/>
-      <w:r>
-        <w:rPr>
-          <w:rFonts w:ascii="Times New Roman" w:hAnsi="Times New Roman" w:cs="Times New Roman"/>
-          <w:lang w:val="en-US" w:eastAsia="nb-NO"/>
-        </w:rPr>
-        <w:t xml:space="preserve"> that joined the group gets the packets</w:t>
+        <w:t>Any receivers that joined the group gets the packets</w:t>
       </w:r>
     </w:p>
     <w:p>
@@ -3116,11 +3046,6 @@
         <w:docPartUnique/>
       </w:docPartObj>
     </w:sdtPr>
-    <w:sdtEndPr>
-      <w:rPr>
-        <w:rStyle w:val="Sidetall"/>
-      </w:rPr>
-    </w:sdtEndPr>
     <w:sdtContent>
       <w:p>
         <w:pPr>
@@ -3179,11 +3104,6 @@
         <w:docPartUnique/>
       </w:docPartObj>
     </w:sdtPr>
-    <w:sdtEndPr>
-      <w:rPr>
-        <w:rStyle w:val="Sidetall"/>
-      </w:rPr>
-    </w:sdtEndPr>
     <w:sdtContent>
       <w:p>
         <w:pPr>
@@ -6629,6 +6549,7 @@
   <w:style w:type="character" w:default="1" w:styleId="Standardskriftforavsnitt">
     <w:name w:val="Default Paragraph Font"/>
     <w:uiPriority w:val="1"/>
+    <w:semiHidden/>
     <w:unhideWhenUsed/>
   </w:style>
   <w:style w:type="table" w:default="1" w:styleId="Vanligtabell">

</xml_diff>